<commit_message>
Add cell-type-resolved single-cell validation, final manuscript text and Word export
Co-Authored-By: Claude Fable 5.1 <noreply@anthropic.com>
Claude-Session: https://claude.ai/code/session_01KQza2MfAdB8Fe4tbJHCnMX
</commit_message>
<xml_diff>
--- a/manuscript/manuscript_JTM.docx
+++ b/manuscript/manuscript_JTM.docx
@@ -92,7 +92,7 @@
         <w:t>Background.</w:t>
       </w:r>
       <w:r>
-        <w:t xml:space="preserve"> Ascending thoracic aortic aneurysm (ATAA) and acute Stanford type A aortic dissection (TAAD) are commonly viewed as stages of a single degenerative process, yet most dissections occur below surgical diameter thresholds and the molecular relationship between the two entities has never been defined systematically.</w:t>
+        <w:t xml:space="preserve"> Ascending thoracic aortic aneurysm (ATAA) and acute Stanford type A aortic dissection (TAAD) are often viewed as stages of one degenerative process, yet most dissections occur below surgical diameter thresholds and their molecular relationship has never been defined systematically.</w:t>
       </w:r>
     </w:p>
     <w:p>
@@ -103,7 +103,7 @@
         <w:t>Methods.</w:t>
       </w:r>
       <w:r>
-        <w:t xml:space="preserve"> We systematically retrieved all human ascending/thoracic aortic tissue transcriptomes from the Gene Expression Omnibus (GEO) and harmonised ten disease-versus-non-diseased bulk cohorts (ATAA: four cohorts, n = 115; TAAD: six cohorts, n = 76; one cohort excluded after quality control). Cohort-level differential expression (limma-trend or DESeq2) was combined by random-effects meta-analysis, gene classes were defined by a formal between-disease difference statistic, and pathways were compared by gene set enrichment analysis (GSEA) of meta-rankings. Cell composition was inferred by single-sample GSEA with markers derived from an integrated ascending-aorta single-cell atlas (73,755 cells; GSE155468, GSE213740). Findings were validated in an independent micro-regional RNA-seq cohort directly contrasting dissected and dilated aortic media (GSE318877; 70 punches) and by a leave-one-cohort-out (LOCO) elastic-net classifier.</w:t>
+        <w:t xml:space="preserve"> All GEO transcriptomes of human ascending/thoracic aortic tissue comparing disease with non-diseased aorta were harmonised (ATAA: four cohorts, n = 115; TAAD: six cohorts, n = 76). Differential expression was combined by random-effects meta-analysis, genes were classified with a between-disease difference statistic, and pathways were compared by GSEA of meta-rankings. Cell composition was inferred by ssGSEA with markers from an integrated ascending-aorta single-cell atlas (73,755 cells). Findings were validated in an independent micro-regional RNA-seq cohort directly contrasting dissected and dilated media and by a leave-one-cohort-out (LOCO) classifier.</w:t>
       </w:r>
     </w:p>
     <w:p>
@@ -114,7 +114,7 @@
         <w:t>Results.</w:t>
       </w:r>
       <w:r>
-        <w:t xml:space="preserve"> The TAAD signature was highly reproducible across cohorts (2,198 consensus genes; median inter-cohort ρ = 0.50; 73–85 % of genes retained when any cohort was omitted), whereas the ATAA signature was weak and cohort-dependent (499 genes; median ρ = 0.12). Meta-analytic effect sizes of the two diseases were only weakly correlated genome-wide (ρ = 0.11) and 137 genes were shared (Jaccard 0.056). TAAD-specific changes (1,780 genes) comprised loss of the smooth-muscle contractile programme (</w:t>
+        <w:t xml:space="preserve"> The TAAD signature was highly reproducible (2,198 consensus genes; inter-cohort ρ = 0.50), whereas the ATAA signature was weak and cohort-dependent (499 genes; ρ = 0.12). Effect sizes of the two diseases were weakly correlated genome-wide (ρ = 0.11) and only 137 genes were shared. TAAD-specific changes (1,780 genes) comprised loss of the smooth-muscle contractile programme (</w:t>
       </w:r>
       <w:r>
         <w:rPr>
@@ -141,7 +141,7 @@
         <w:t>CNN1</w:t>
       </w:r>
       <w:r>
-        <w:t>), loss of endothelial and adventitial transcripts, and gain of hypoxia/oxidative-stress (</w:t>
+        <w:t>) and of endothelial/adventitial transcripts, with gain of hypoxia/oxidative-stress (</w:t>
       </w:r>
       <w:r>
         <w:rPr>
@@ -168,7 +168,7 @@
         <w:t>VEGFA</w:t>
       </w:r>
       <w:r>
-        <w:t>), MYC/mTORC1/E2F biosynthetic, p53/DNA-damage, unfolded-protein and innate inflammatory programmes (</w:t>
+        <w:t>), MYC/mTORC1/E2F, p53, unfolded-protein and innate inflammatory programmes (</w:t>
       </w:r>
       <w:r>
         <w:rPr>
@@ -192,7 +192,16 @@
         <w:rPr>
           <w:i/>
         </w:rPr>
-        <w:t>CCL2</w:t>
+        <w:t>S100A8/A9</w:t>
+      </w:r>
+      <w:r>
+        <w:t xml:space="preserve">); </w:t>
+      </w:r>
+      <w:r>
+        <w:rPr>
+          <w:i/>
+        </w:rPr>
+        <w:t>AKT1</w:t>
       </w:r>
       <w:r>
         <w:t xml:space="preserve">, </w:t>
@@ -201,16 +210,25 @@
         <w:rPr>
           <w:i/>
         </w:rPr>
-        <w:t>S100A8/A9</w:t>
-      </w:r>
-      <w:r>
-        <w:t xml:space="preserve">), with </w:t>
+        <w:t>STAT3</w:t>
+      </w:r>
+      <w:r>
+        <w:t xml:space="preserve"> and </w:t>
       </w:r>
       <w:r>
         <w:rPr>
           <w:i/>
         </w:rPr>
-        <w:t>AKT1</w:t>
+        <w:t>MYC</w:t>
+      </w:r>
+      <w:r>
+        <w:t xml:space="preserve"> were network hubs. ATAA-enriched changes (230 genes) centred on type I interferon signalling (</w:t>
+      </w:r>
+      <w:r>
+        <w:rPr>
+          <w:i/>
+        </w:rPr>
+        <w:t>OAS1-3</w:t>
       </w:r>
       <w:r>
         <w:t xml:space="preserve">, </w:t>
@@ -219,25 +237,25 @@
         <w:rPr>
           <w:i/>
         </w:rPr>
-        <w:t>STAT3</w:t>
-      </w:r>
-      <w:r>
-        <w:t xml:space="preserve"> and </w:t>
+        <w:t>IFIT1-3</w:t>
+      </w:r>
+      <w:r>
+        <w:t xml:space="preserve">, </w:t>
       </w:r>
       <w:r>
         <w:rPr>
           <w:i/>
         </w:rPr>
-        <w:t>MYC</w:t>
-      </w:r>
-      <w:r>
-        <w:t xml:space="preserve"> as network hubs. ATAA-enriched changes (230 genes) centred on type I interferon signalling (</w:t>
+        <w:t>CXCL10</w:t>
+      </w:r>
+      <w:r>
+        <w:t>), MHC class II antigen presentation (</w:t>
       </w:r>
       <w:r>
         <w:rPr>
           <w:i/>
         </w:rPr>
-        <w:t>OAS1-3</w:t>
+        <w:t>CD74</w:t>
       </w:r>
       <w:r>
         <w:t xml:space="preserve">, </w:t>
@@ -246,46 +264,10 @@
         <w:rPr>
           <w:i/>
         </w:rPr>
-        <w:t>IFIT1-3</w:t>
-      </w:r>
-      <w:r>
-        <w:t xml:space="preserve">, </w:t>
-      </w:r>
-      <w:r>
-        <w:rPr>
-          <w:i/>
-        </w:rPr>
-        <w:t>MX1/2</w:t>
-      </w:r>
-      <w:r>
-        <w:t xml:space="preserve">, </w:t>
-      </w:r>
-      <w:r>
-        <w:rPr>
-          <w:i/>
-        </w:rPr>
-        <w:t>CXCL10</w:t>
-      </w:r>
-      <w:r>
-        <w:t>), MHC class II antigen presentation (</w:t>
-      </w:r>
-      <w:r>
-        <w:rPr>
-          <w:i/>
-        </w:rPr>
-        <w:t>CD74</w:t>
-      </w:r>
-      <w:r>
-        <w:t xml:space="preserve">, </w:t>
-      </w:r>
-      <w:r>
-        <w:rPr>
-          <w:i/>
-        </w:rPr>
-        <w:t>HLA-DRA/-DPA1/-DPB1</w:t>
-      </w:r>
-      <w:r>
-        <w:t>) and collagen/ECM genes. Composition inference indicated depletion of smooth-muscle, fibroblast and endothelial signatures with S100A8/A9⁺ myeloid infiltration in TAAD versus lymphoid (T/NK/plasma) infiltration without smooth-muscle loss in ATAA, consistent with single-cell proportions. Pathway-level differences replicated in the direct-contrast cohort (ρ = 0.42, P = 5 × 10⁻⁴⁸), and the LOCO classifier discriminated TAAD from ATAA with a pooled AUC of 0.92.</w:t>
+        <w:t>HLA-DR/DP</w:t>
+      </w:r>
+      <w:r>
+        <w:t>) and collagen genes. Composition inference indicated loss of smooth-muscle, fibroblast and endothelial signatures with S100A8/A9⁺ myeloid infiltration in TAAD versus lymphoid infiltration without smooth-muscle loss in ATAA. Pathway differences replicated in the direct-contrast cohort (ρ = 0.42) and the LOCO classifier discriminated TAAD from ATAA (AUC 0.92).</w:t>
       </w:r>
     </w:p>
     <w:p>
@@ -296,7 +278,7 @@
         <w:t>Conclusions.</w:t>
       </w:r>
       <w:r>
-        <w:t xml:space="preserve"> ATAA and TAAD share a limited NF-κB/IL-6/hypoxia core but are otherwise governed by distinct programmes: adaptive/interferon immune activation with fibrotic remodelling in aneurysm versus acute cellular stress, smooth-muscle loss and innate inflammation in dissection. These results argue against a simple continuum model and provide disease-specific molecular targets and biomarker candidates.</w:t>
+        <w:t xml:space="preserve"> ATAA and TAAD share a limited NF-κB/IL-6/hypoxia core but are otherwise governed by distinct programmes: interferon/adaptive immune activation with matrix remodelling in aneurysm versus acute cellular stress, smooth-muscle loss and innate inflammation in dissection, arguing against a simple continuum model and providing disease-specific targets and biomarker candidates.</w:t>
       </w:r>
     </w:p>
     <w:p>
@@ -1763,7 +1745,129 @@
     </w:p>
     <w:p>
       <w:r>
-        <w:t>Mapping the gene classes onto control-aorta cell types showed that TAAD-specific down-regulated genes were predominantly expressed by contractile SMC (35 % of genes) and endothelial cells (23 %), whereas TAAD-specific up-regulated genes were most often expressed by inflammatory myeloid cells (19 %), endothelial cells (14 %) and fibroblasts (12 %). ATAA-specific up-regulated genes were most often expressed by macrophages (19 %), fibroblasts (16 %) and fibromyocytes (13 %), and the shared down-regulated genes were overwhelmingly contractile-SMC transcripts (61 %; Fig. 8c). Thus, part of the TAAD signature is explained by changes in cellular composition, but a substantial part reflects transcriptional reprogramming within resident cells. [SC-VALIDATION-PARAGRAPH]</w:t>
+        <w:t>Mapping the gene classes onto control-aorta cell types showed that TAAD-specific down-regulated genes were predominantly expressed by contractile SMC (35 % of genes) and endothelial cells (23 %), whereas TAAD-specific up-regulated genes were most often expressed by inflammatory myeloid cells (19 %), endothelial cells (14 %) and fibroblasts (12 %). ATAA-specific up-regulated genes were most often expressed by macrophages (19 %), fibroblasts (16 %) and fibromyocytes (13 %), and the shared down-regulated genes were overwhelmingly contractile-SMC transcripts (61 %; Fig. 8c). Thus, part of the TAAD signature is explained by changes in cellular composition, but a substantial part reflects transcriptional reprogramming within resident cells.</w:t>
+      </w:r>
+    </w:p>
+    <w:p>
+      <w:r>
+        <w:t>Cell-type-resolved pseudo-bulk comparisons confirmed this and showed that the divergence between the diseases holds within individual cell types (Fig. 8a, b; Additional file 4). In the TAAD dataset, TAAD-specific genes changed in the predicted direction within contractile SMC (69 % concordance), modulated SMC (80 %), fibromyocytes (74 %), fibroblasts (76 %) and endothelial cells (76 %; all Wilcoxon P &lt; 10⁻¹⁰), whereas in the ATAA dataset the same genes showed only marginal concordance within the corresponding cell types (51–60 %; median signed log2FC ≤ 0.14). Conversely, ATAA-specific genes were modestly reproduced within aneurysm mural and stromal cells (contractile SMC 64 %, modulated SMC 60 %, fibromyocytes 56 %, fibroblasts 56 %; P ≤ 0.013) but were actively reversed within dissection cells (contractile SMC 24 %, fibroblasts 27 %, endothelial cells 32 %, myeloid cells 32–34 %; median signed log2FC −0.25 to −0.33; all P &lt; 10⁻⁵). Shared-concordant genes were reproduced within mural cells of both datasets (contractile SMC 91 % and fibromyocytes 88 % in ATAA; modulated SMC 81 % and endothelial cells 77 % in TAAD). At the level of individual genes, the metallothionein/stress cluster (</w:t>
+      </w:r>
+      <w:r>
+        <w:rPr>
+          <w:i/>
+        </w:rPr>
+        <w:t>MT1X</w:t>
+      </w:r>
+      <w:r>
+        <w:t xml:space="preserve">, </w:t>
+      </w:r>
+      <w:r>
+        <w:rPr>
+          <w:i/>
+        </w:rPr>
+        <w:t>MT2A</w:t>
+      </w:r>
+      <w:r>
+        <w:t xml:space="preserve">, </w:t>
+      </w:r>
+      <w:r>
+        <w:rPr>
+          <w:i/>
+        </w:rPr>
+        <w:t>GLRX</w:t>
+      </w:r>
+      <w:r>
+        <w:t xml:space="preserve">, </w:t>
+      </w:r>
+      <w:r>
+        <w:rPr>
+          <w:i/>
+        </w:rPr>
+        <w:t>HK2</w:t>
+      </w:r>
+      <w:r>
+        <w:t xml:space="preserve">, </w:t>
+      </w:r>
+      <w:r>
+        <w:rPr>
+          <w:i/>
+        </w:rPr>
+        <w:t>SERPINA1</w:t>
+      </w:r>
+      <w:r>
+        <w:t xml:space="preserve">, </w:t>
+      </w:r>
+      <w:r>
+        <w:rPr>
+          <w:i/>
+        </w:rPr>
+        <w:t>NNMT</w:t>
+      </w:r>
+      <w:r>
+        <w:t xml:space="preserve">, </w:t>
+      </w:r>
+      <w:r>
+        <w:rPr>
+          <w:i/>
+        </w:rPr>
+        <w:t>SLC38A5</w:t>
+      </w:r>
+      <w:r>
+        <w:t>) was induced across SMC, fibromyocyte and fibroblast populations only in dissection, whereas MHC class II genes (</w:t>
+      </w:r>
+      <w:r>
+        <w:rPr>
+          <w:i/>
+        </w:rPr>
+        <w:t>HLA-DRA</w:t>
+      </w:r>
+      <w:r>
+        <w:t xml:space="preserve">, </w:t>
+      </w:r>
+      <w:r>
+        <w:rPr>
+          <w:i/>
+        </w:rPr>
+        <w:t>HLA-DPA1</w:t>
+      </w:r>
+      <w:r>
+        <w:t xml:space="preserve">, </w:t>
+      </w:r>
+      <w:r>
+        <w:rPr>
+          <w:i/>
+        </w:rPr>
+        <w:t>HLA-DPB1</w:t>
+      </w:r>
+      <w:r>
+        <w:t xml:space="preserve">, </w:t>
+      </w:r>
+      <w:r>
+        <w:rPr>
+          <w:i/>
+        </w:rPr>
+        <w:t>CD74</w:t>
+      </w:r>
+      <w:r>
+        <w:t xml:space="preserve">), </w:t>
+      </w:r>
+      <w:r>
+        <w:rPr>
+          <w:i/>
+        </w:rPr>
+        <w:t>OAS2</w:t>
+      </w:r>
+      <w:r>
+        <w:t xml:space="preserve"> and </w:t>
+      </w:r>
+      <w:r>
+        <w:rPr>
+          <w:i/>
+        </w:rPr>
+        <w:t>SFRP4</w:t>
+      </w:r>
+      <w:r>
+        <w:t xml:space="preserve"> were induced in aneurysm stromal cells and reduced in dissection cells (Fig. 8a, b). The disease-specific programmes therefore represent cell-intrinsic reprogramming of the resident aortic wall cells rather than solely differences in infiltrating cell content.</w:t>
       </w:r>
     </w:p>
     <w:p>

</xml_diff>

<commit_message>
v2.1 review round 3: Figure 6 scale correction (score-scale delta panel), Figure 4 with GSE189795 substitute, whole-SMC sensitivity text and Table 2 block, legends, Word re-export
Co-Authored-By: Claude Fable 5.1 <noreply@anthropic.com>
Claude-Session: https://claude.ai/code/session_01KQza2MfAdB8Fe4tbJHCnMX
</commit_message>
<xml_diff>
--- a/manuscript/manuscript_JTM.docx
+++ b/manuscript/manuscript_JTM.docx
@@ -114,7 +114,7 @@
         <w:t>Results.</w:t>
       </w:r>
       <w:r>
-        <w:t xml:space="preserve"> Contractile programme loss differed between the diseases (pooled Hedges' g −2.11 in TAAD vs −0.34 in ATAA; difference −1.77, Holm P &lt; 0.001), whereas the injury composite was higher in both and only borderline different (+1.75 vs +0.56; Holm P = 0.10) and the relative state R did not differ (+0.20 vs +0.24; P = 0.92). Glycolysis, oxidative-stress and MYC-ribosome modules were higher in TAAD (BH ≤ 0.02), and in TAAD these effects survived conditioning on three cell-signature scores. Interferon-α, MHC class II, T-cell and ECM-collagen scores were raised in ATAA but the differences from TAAD were not significant. Within contractile smooth muscle cells, C was lower in both diseases (g −0.95 and −0.98; CIs excluding 0) while I and R showed no clear change, and the primary patient-level tests of R were not passed (exact P = 0.37 and 0.79). [[STAGE_ABSTRACT]] Within aneurysm patients, R did not differ between belly and neck (P = 0.19). Across ordered dilatation in one cohort, C decreased (ρ = −0.35, BH = 0.016) while interferon, MHC class II, lymphoid and ECM scores increased (BH ≤ 0.03) and I showed no trend. A nested leave-one-cohort-out classifier separated the diseases (pooled AUC 0.90).</w:t>
+        <w:t xml:space="preserve"> Contractile programme loss differed between the diseases (pooled Hedges' g −2.11 in TAAD vs −0.34 in ATAA; difference −1.77, Holm P &lt; 0.001), whereas the injury composite was higher in both and only borderline different (+1.75 vs +0.56; Holm P = 0.10) and the relative state R did not differ (+0.20 vs +0.24; P = 0.92). Glycolysis, oxidative-stress and MYC-ribosome modules were higher in TAAD (BH ≤ 0.02), and in TAAD these effects survived conditioning on three cell-signature scores. Interferon-α, MHC class II, T-cell and ECM-collagen scores were raised in ATAA but the differences from TAAD were not significant. Within contractile smooth muscle cells, point estimates of C were lower in both diseases (g −0.95 and −0.98) but the exact patient-level tests did not support a difference (P = 0.17 in each dataset), I showed no clear change, and the primary tests of R were not passed (exact P = 0.37 and 0.79). In a dissection dataset with acute, subacute and chronic stages (estimation only; sampling position differed between stages), acute-stage contractile SMC had a lower C than control and later-stage SMC (g −1.97 and −1.86) without a higher injury composite. In an external acute-dissection dataset the planned contractile-SMC test was not estimable because no contractile-SMC cluster was recovered; modulated SMC showed a lower C (exploratory, g −2.47) without a higher I. Within aneurysm patients, R did not differ between belly and neck (P = 0.19). Across ordered dilatation in one cohort, C decreased (ρ = −0.35, BH = 0.016) while interferon, MHC class II, lymphoid and ECM scores increased (BH ≤ 0.03); no trend of I was detected. A nested leave-one-cohort-out classifier separated the diseases (pooled AUC 0.90).</w:t>
       </w:r>
     </w:p>
     <w:p>
@@ -125,7 +125,7 @@
         <w:t>Conclusions.</w:t>
       </w:r>
       <w:r>
-        <w:t xml:space="preserve"> At the tissue level, TAAD and ATAA differ mainly in the magnitude of contractile loss and metabolic/stress activation, while the relative state of the two programmes does not differ; the hypothesis that the two diseases organise these programmes differently was not supported by the available patient-level data, which were underpowered. Aneurysmal dilatation is accompanied by contractile decrease and immune and matrix programmes without the injury composite that characterises dissection.</w:t>
+        <w:t xml:space="preserve"> In the included public tissue transcriptome cohorts, TAAD showed a larger decrease of contractile-related expression and stronger increases of some metabolic and stress modules than ATAA. The pre-specified relative-state measure R showed no detectable difference between the diseases, and patient-level analyses within cell types and within patients gave no consistent support, so whether these tissue-level differences correspond to a different organisation of the two programmes cannot be determined from the available data. In one ordered-dilatation cohort, contractile, immune and matrix programmes showed different associations with dilatation; their generality across cohorts and their cellular source remain to be tested.</w:t>
       </w:r>
     </w:p>
     <w:p>
@@ -2118,7 +2118,7 @@
               <w:rPr>
                 <w:sz w:val="15"/>
               </w:rPr>
-              <w:t>patient-level test in contractile SMC (F2); acute-stage external replicate</w:t>
+              <w:t>F2 primary test not estimable (no contractile-SMC cluster recovered); exploratory modulated-SMC estimate</w:t>
             </w:r>
           </w:p>
         </w:tc>
@@ -2284,7 +2284,7 @@
     </w:p>
     <w:p>
       <w:r>
-        <w:t>For each disease, log2 fold changes were combined by DerSimonian–Laird random-effects models with τ² truncated at zero (the primary estimator) [24,25]; Hartung–Knapp–Sidik–Jonkman (HKSJ) adjustment was a sensitivity analysis, and the implementation was checked gene by gene against statsmodels using identical effects, variances and missing-data handling (Additional file 5). Genes present in ≥ 75 % of cohorts were considered. A consensus differentially expressed gene (DEG) required random-effects FDR &lt; 0.05, the same direction in ≥ 75 % of cohorts and nominal P &lt; 0.05 with the same direction in ≥ 50 % of cohorts. Robustness was assessed by leave-one-cohort-out (LOCO) re-analysis and, for TAAD, by all 15 four-of-six cohort subsets to match the ATAA cohort number. The between-disease difference was tested with z_diff = (LFC_TAAD − LFC_ATAA)/√(SE_TAAD² + SE_ATAA²) and FDR-adjusted. Genes were classed as enriched in one disease when FDR_diff &lt; 0.05 and the gene was a consensus DEG in that disease; a two-one-sided-test (TOST) of equivalence to zero (|log2FC| &lt; 0.5, 90 % CI) in the other disease added a descriptive tier ("enriched, near-zero in the other disease"); the 0.5 bound is a declared operational bound, not a validated biological threshold (Additional file 6). Pre-ranked GSEA of the disease and difference rankings (gseapy; MSigDB v2024.1 Hallmark, KEGG legacy, Reactome) was retained as a descriptive pathway summary [26–28].</w:t>
+        <w:t>For each disease, log2 fold changes were combined by DerSimonian–Laird random-effects models with τ² truncated at zero (the primary estimator) [24,25]; Hartung–Knapp–Sidik–Jonkman (HKSJ) adjustment was a sensitivity analysis. The implementation was checked gene by gene against statsmodels (combine_effects, DerSimonian–Laird) with identical effects, variances and missing-data handling; because statsmodels does not truncate a negative DerSimonian–Laird τ² whereas our implementation does, the comparison applied the same truncation to the statsmodels τ² before recomputing weights, pooled effects and the Knapp–Hartung variance. Under that common convention the pooled log2FC, SE, normal-theory P and HKSJ P agreed to machine precision for all 23,955 genes (maximum absolute difference 5.9e-15; no non-finite values); the raw untruncated statsmodels output differs for the 6,789 genes (28 %) with negative τ² and is non-finite for 3,620 of them (Additional file 5). Genes present in ≥ 75 % of cohorts were considered. A consensus differentially expressed gene (DEG) required random-effects FDR &lt; 0.05, the same direction in ≥ 75 % of cohorts and nominal P &lt; 0.05 with the same direction in ≥ 50 % of cohorts. Robustness was assessed by leave-one-cohort-out (LOCO) re-analysis and, for TAAD, by all 15 four-of-six cohort subsets to match the ATAA cohort number. The between-disease difference was tested with z_diff = (LFC_TAAD − LFC_ATAA)/√(SE_TAAD² + SE_ATAA²) and FDR-adjusted. Genes were classed as enriched in one disease when FDR_diff &lt; 0.05 and the gene was a consensus DEG in that disease; a two-one-sided-test (TOST) of equivalence to zero (|log2FC| &lt; 0.5, 90 % CI) in the other disease added a descriptive tier ("enriched, near-zero in the other disease"); the 0.5 bound is a declared operational bound, not a validated biological threshold (Additional file 6). Pre-ranked GSEA of the disease and difference rankings (gseapy; MSigDB v2024.1 Hallmark, KEGG legacy, Reactome) was retained as a descriptive pathway summary [26–28].</w:t>
       </w:r>
     </w:p>
     <w:p>
@@ -2540,7 +2540,7 @@
         <w:t>F2 (single-cell, patient level):</w:t>
       </w:r>
       <w:r>
-        <w:t xml:space="preserve"> in each of GSE155468, GSE213740 and GSE189795 a single test of R in contractile SMC pseudo-bulk by exact enumeration of all group assignments (each dataset its own α = 0.05; different datasets and hypotheses were not combined into one family). </w:t>
+        <w:t xml:space="preserve"> in each of GSE155468, GSE213740 and GSE189795 a single test of R in contractile SMC pseudo-bulk by exact enumeration of all group assignments (each dataset its own α = 0.05; different datasets and hypotheses were not combined into one family); where the cell type could not be recovered in at least four patients the test was recorded as not estimable rather than replaced. </w:t>
       </w:r>
       <w:r>
         <w:rPr>
@@ -7344,6 +7344,2266 @@
               <w:rPr>
                 <w:sz w:val="13"/>
               </w:rPr>
+              <w:t>3. Stage: acute dissection (external replicate)</w:t>
+            </w:r>
+          </w:p>
+        </w:tc>
+        <w:tc>
+          <w:tcPr>
+            <w:tcW w:type="dxa" w:w="1045"/>
+          </w:tcPr>
+          <w:p>
+            <w:r>
+              <w:rPr>
+                <w:sz w:val="13"/>
+              </w:rPr>
+              <w:t>GSE189795</w:t>
+            </w:r>
+          </w:p>
+        </w:tc>
+        <w:tc>
+          <w:tcPr>
+            <w:tcW w:type="dxa" w:w="1045"/>
+          </w:tcPr>
+          <w:p>
+            <w:r>
+              <w:rPr>
+                <w:sz w:val="13"/>
+              </w:rPr>
+              <w:t>acute TAAD vs control</w:t>
+            </w:r>
+          </w:p>
+        </w:tc>
+        <w:tc>
+          <w:tcPr>
+            <w:tcW w:type="dxa" w:w="1045"/>
+          </w:tcPr>
+          <w:p>
+            <w:r>
+              <w:rPr>
+                <w:sz w:val="13"/>
+              </w:rPr>
+              <w:t>R</w:t>
+            </w:r>
+          </w:p>
+        </w:tc>
+        <w:tc>
+          <w:tcPr>
+            <w:tcW w:type="dxa" w:w="1045"/>
+          </w:tcPr>
+          <w:p>
+            <w:r>
+              <w:rPr>
+                <w:sz w:val="13"/>
+              </w:rPr>
+            </w:r>
+          </w:p>
+        </w:tc>
+        <w:tc>
+          <w:tcPr>
+            <w:tcW w:type="dxa" w:w="1045"/>
+          </w:tcPr>
+          <w:p>
+            <w:r>
+              <w:rPr>
+                <w:sz w:val="13"/>
+              </w:rPr>
+              <w:t>no contractile-SMC cluster recovered (SMC-like cells 26-371 per patient, all classified as modulated)</w:t>
+            </w:r>
+          </w:p>
+        </w:tc>
+        <w:tc>
+          <w:tcPr>
+            <w:tcW w:type="dxa" w:w="1045"/>
+          </w:tcPr>
+          <w:p>
+            <w:r>
+              <w:rPr>
+                <w:sz w:val="13"/>
+              </w:rPr>
+              <w:t>not estimable (F2 primary; cell type missing)</w:t>
+            </w:r>
+          </w:p>
+        </w:tc>
+        <w:tc>
+          <w:tcPr>
+            <w:tcW w:type="dxa" w:w="1045"/>
+          </w:tcPr>
+          <w:p>
+            <w:r>
+              <w:rPr>
+                <w:sz w:val="13"/>
+              </w:rPr>
+              <w:t>not estimated</w:t>
+            </w:r>
+          </w:p>
+        </w:tc>
+        <w:tc>
+          <w:tcPr>
+            <w:tcW w:type="dxa" w:w="1045"/>
+          </w:tcPr>
+          <w:p>
+            <w:r>
+              <w:rPr>
+                <w:sz w:val="13"/>
+              </w:rPr>
+              <w:t>not estimable</w:t>
+            </w:r>
+          </w:p>
+        </w:tc>
+      </w:tr>
+      <w:tr>
+        <w:tc>
+          <w:tcPr>
+            <w:tcW w:type="dxa" w:w="1045"/>
+          </w:tcPr>
+          <w:p>
+            <w:r>
+              <w:rPr>
+                <w:sz w:val="13"/>
+              </w:rPr>
+              <w:t>3. Stage: acute dissection (external replicate)</w:t>
+            </w:r>
+          </w:p>
+        </w:tc>
+        <w:tc>
+          <w:tcPr>
+            <w:tcW w:type="dxa" w:w="1045"/>
+          </w:tcPr>
+          <w:p>
+            <w:r>
+              <w:rPr>
+                <w:sz w:val="13"/>
+              </w:rPr>
+              <w:t>GSE189795</w:t>
+            </w:r>
+          </w:p>
+        </w:tc>
+        <w:tc>
+          <w:tcPr>
+            <w:tcW w:type="dxa" w:w="1045"/>
+          </w:tcPr>
+          <w:p>
+            <w:r>
+              <w:rPr>
+                <w:sz w:val="13"/>
+              </w:rPr>
+              <w:t>acute TAAD vs control (modulated SMC, exploratory substitute)</w:t>
+            </w:r>
+          </w:p>
+        </w:tc>
+        <w:tc>
+          <w:tcPr>
+            <w:tcW w:type="dxa" w:w="1045"/>
+          </w:tcPr>
+          <w:p>
+            <w:r>
+              <w:rPr>
+                <w:sz w:val="13"/>
+              </w:rPr>
+              <w:t>C</w:t>
+            </w:r>
+          </w:p>
+        </w:tc>
+        <w:tc>
+          <w:tcPr>
+            <w:tcW w:type="dxa" w:w="1045"/>
+          </w:tcPr>
+          <w:p>
+            <w:r>
+              <w:rPr>
+                <w:sz w:val="13"/>
+              </w:rPr>
+              <w:t>-2.47 [-6.13, -1.87]</w:t>
+            </w:r>
+          </w:p>
+        </w:tc>
+        <w:tc>
+          <w:tcPr>
+            <w:tcW w:type="dxa" w:w="1045"/>
+          </w:tcPr>
+          <w:p>
+            <w:r>
+              <w:rPr>
+                <w:sz w:val="13"/>
+              </w:rPr>
+              <w:t>4 vs 4</w:t>
+            </w:r>
+          </w:p>
+        </w:tc>
+        <w:tc>
+          <w:tcPr>
+            <w:tcW w:type="dxa" w:w="1045"/>
+          </w:tcPr>
+          <w:p>
+            <w:r>
+              <w:rPr>
+                <w:sz w:val="13"/>
+              </w:rPr>
+              <w:t>exploratory (exact P = 0.029; 70 assignments; BH = 1.00)</w:t>
+            </w:r>
+          </w:p>
+        </w:tc>
+        <w:tc>
+          <w:tcPr>
+            <w:tcW w:type="dxa" w:w="1045"/>
+          </w:tcPr>
+          <w:p>
+            <w:r>
+              <w:rPr>
+                <w:sz w:val="13"/>
+              </w:rPr>
+              <w:t>CI excludes 0</w:t>
+            </w:r>
+          </w:p>
+        </w:tc>
+        <w:tc>
+          <w:tcPr>
+            <w:tcW w:type="dxa" w:w="1045"/>
+          </w:tcPr>
+          <w:p>
+            <w:r>
+              <w:rPr>
+                <w:sz w:val="13"/>
+              </w:rPr>
+              <w:t>limited precision (n small; low per-cell depth)</w:t>
+            </w:r>
+          </w:p>
+        </w:tc>
+      </w:tr>
+      <w:tr>
+        <w:tc>
+          <w:tcPr>
+            <w:tcW w:type="dxa" w:w="1045"/>
+          </w:tcPr>
+          <w:p>
+            <w:r>
+              <w:rPr>
+                <w:sz w:val="13"/>
+              </w:rPr>
+              <w:t>3. Stage: acute dissection (external replicate)</w:t>
+            </w:r>
+          </w:p>
+        </w:tc>
+        <w:tc>
+          <w:tcPr>
+            <w:tcW w:type="dxa" w:w="1045"/>
+          </w:tcPr>
+          <w:p>
+            <w:r>
+              <w:rPr>
+                <w:sz w:val="13"/>
+              </w:rPr>
+              <w:t>GSE189795</w:t>
+            </w:r>
+          </w:p>
+        </w:tc>
+        <w:tc>
+          <w:tcPr>
+            <w:tcW w:type="dxa" w:w="1045"/>
+          </w:tcPr>
+          <w:p>
+            <w:r>
+              <w:rPr>
+                <w:sz w:val="13"/>
+              </w:rPr>
+              <w:t>acute TAAD vs control (modulated SMC, exploratory substitute)</w:t>
+            </w:r>
+          </w:p>
+        </w:tc>
+        <w:tc>
+          <w:tcPr>
+            <w:tcW w:type="dxa" w:w="1045"/>
+          </w:tcPr>
+          <w:p>
+            <w:r>
+              <w:rPr>
+                <w:sz w:val="13"/>
+              </w:rPr>
+              <w:t>I</w:t>
+            </w:r>
+          </w:p>
+        </w:tc>
+        <w:tc>
+          <w:tcPr>
+            <w:tcW w:type="dxa" w:w="1045"/>
+          </w:tcPr>
+          <w:p>
+            <w:r>
+              <w:rPr>
+                <w:sz w:val="13"/>
+              </w:rPr>
+              <w:t>+0.44 [-0.72, 2.47]</w:t>
+            </w:r>
+          </w:p>
+        </w:tc>
+        <w:tc>
+          <w:tcPr>
+            <w:tcW w:type="dxa" w:w="1045"/>
+          </w:tcPr>
+          <w:p>
+            <w:r>
+              <w:rPr>
+                <w:sz w:val="13"/>
+              </w:rPr>
+              <w:t>4 vs 4</w:t>
+            </w:r>
+          </w:p>
+        </w:tc>
+        <w:tc>
+          <w:tcPr>
+            <w:tcW w:type="dxa" w:w="1045"/>
+          </w:tcPr>
+          <w:p>
+            <w:r>
+              <w:rPr>
+                <w:sz w:val="13"/>
+              </w:rPr>
+              <w:t>exploratory (exact P = 0.457; 70 assignments; BH = 1.00)</w:t>
+            </w:r>
+          </w:p>
+        </w:tc>
+        <w:tc>
+          <w:tcPr>
+            <w:tcW w:type="dxa" w:w="1045"/>
+          </w:tcPr>
+          <w:p>
+            <w:r>
+              <w:rPr>
+                <w:sz w:val="13"/>
+              </w:rPr>
+              <w:t>CI includes 0</w:t>
+            </w:r>
+          </w:p>
+        </w:tc>
+        <w:tc>
+          <w:tcPr>
+            <w:tcW w:type="dxa" w:w="1045"/>
+          </w:tcPr>
+          <w:p>
+            <w:r>
+              <w:rPr>
+                <w:sz w:val="13"/>
+              </w:rPr>
+              <w:t>limited precision (n small; low per-cell depth)</w:t>
+            </w:r>
+          </w:p>
+        </w:tc>
+      </w:tr>
+      <w:tr>
+        <w:tc>
+          <w:tcPr>
+            <w:tcW w:type="dxa" w:w="1045"/>
+          </w:tcPr>
+          <w:p>
+            <w:r>
+              <w:rPr>
+                <w:sz w:val="13"/>
+              </w:rPr>
+              <w:t>3. Stage: acute dissection (external replicate)</w:t>
+            </w:r>
+          </w:p>
+        </w:tc>
+        <w:tc>
+          <w:tcPr>
+            <w:tcW w:type="dxa" w:w="1045"/>
+          </w:tcPr>
+          <w:p>
+            <w:r>
+              <w:rPr>
+                <w:sz w:val="13"/>
+              </w:rPr>
+              <w:t>GSE189795</w:t>
+            </w:r>
+          </w:p>
+        </w:tc>
+        <w:tc>
+          <w:tcPr>
+            <w:tcW w:type="dxa" w:w="1045"/>
+          </w:tcPr>
+          <w:p>
+            <w:r>
+              <w:rPr>
+                <w:sz w:val="13"/>
+              </w:rPr>
+              <w:t>acute TAAD vs control (modulated SMC, exploratory substitute)</w:t>
+            </w:r>
+          </w:p>
+        </w:tc>
+        <w:tc>
+          <w:tcPr>
+            <w:tcW w:type="dxa" w:w="1045"/>
+          </w:tcPr>
+          <w:p>
+            <w:r>
+              <w:rPr>
+                <w:sz w:val="13"/>
+              </w:rPr>
+              <w:t>R</w:t>
+            </w:r>
+          </w:p>
+        </w:tc>
+        <w:tc>
+          <w:tcPr>
+            <w:tcW w:type="dxa" w:w="1045"/>
+          </w:tcPr>
+          <w:p>
+            <w:r>
+              <w:rPr>
+                <w:sz w:val="13"/>
+              </w:rPr>
+              <w:t>-0.58 [-3.49, 0.64]</w:t>
+            </w:r>
+          </w:p>
+        </w:tc>
+        <w:tc>
+          <w:tcPr>
+            <w:tcW w:type="dxa" w:w="1045"/>
+          </w:tcPr>
+          <w:p>
+            <w:r>
+              <w:rPr>
+                <w:sz w:val="13"/>
+              </w:rPr>
+              <w:t>4 vs 4</w:t>
+            </w:r>
+          </w:p>
+        </w:tc>
+        <w:tc>
+          <w:tcPr>
+            <w:tcW w:type="dxa" w:w="1045"/>
+          </w:tcPr>
+          <w:p>
+            <w:r>
+              <w:rPr>
+                <w:sz w:val="13"/>
+              </w:rPr>
+              <w:t>exploratory (exact P = 0.400; 70 assignments; BH = 1.00)</w:t>
+            </w:r>
+          </w:p>
+        </w:tc>
+        <w:tc>
+          <w:tcPr>
+            <w:tcW w:type="dxa" w:w="1045"/>
+          </w:tcPr>
+          <w:p>
+            <w:r>
+              <w:rPr>
+                <w:sz w:val="13"/>
+              </w:rPr>
+              <w:t>CI includes 0</w:t>
+            </w:r>
+          </w:p>
+        </w:tc>
+        <w:tc>
+          <w:tcPr>
+            <w:tcW w:type="dxa" w:w="1045"/>
+          </w:tcPr>
+          <w:p>
+            <w:r>
+              <w:rPr>
+                <w:sz w:val="13"/>
+              </w:rPr>
+              <w:t>limited precision (n small; low per-cell depth)</w:t>
+            </w:r>
+          </w:p>
+        </w:tc>
+      </w:tr>
+      <w:tr>
+        <w:tc>
+          <w:tcPr>
+            <w:tcW w:type="dxa" w:w="1045"/>
+          </w:tcPr>
+          <w:p>
+            <w:r>
+              <w:rPr>
+                <w:sz w:val="13"/>
+              </w:rPr>
+              <w:t>3. Stage: within-cohort stages (estimation only)</w:t>
+            </w:r>
+          </w:p>
+        </w:tc>
+        <w:tc>
+          <w:tcPr>
+            <w:tcW w:type="dxa" w:w="1045"/>
+          </w:tcPr>
+          <w:p>
+            <w:r>
+              <w:rPr>
+                <w:sz w:val="13"/>
+              </w:rPr>
+              <w:t>GSE222318</w:t>
+            </w:r>
+          </w:p>
+        </w:tc>
+        <w:tc>
+          <w:tcPr>
+            <w:tcW w:type="dxa" w:w="1045"/>
+          </w:tcPr>
+          <w:p>
+            <w:r>
+              <w:rPr>
+                <w:sz w:val="13"/>
+              </w:rPr>
+              <w:t>acute vs control</w:t>
+            </w:r>
+          </w:p>
+        </w:tc>
+        <w:tc>
+          <w:tcPr>
+            <w:tcW w:type="dxa" w:w="1045"/>
+          </w:tcPr>
+          <w:p>
+            <w:r>
+              <w:rPr>
+                <w:sz w:val="13"/>
+              </w:rPr>
+              <w:t>C</w:t>
+            </w:r>
+          </w:p>
+        </w:tc>
+        <w:tc>
+          <w:tcPr>
+            <w:tcW w:type="dxa" w:w="1045"/>
+          </w:tcPr>
+          <w:p>
+            <w:r>
+              <w:rPr>
+                <w:sz w:val="13"/>
+              </w:rPr>
+              <w:t>-1.97 [-9.70, -1.14]</w:t>
+            </w:r>
+          </w:p>
+        </w:tc>
+        <w:tc>
+          <w:tcPr>
+            <w:tcW w:type="dxa" w:w="1045"/>
+          </w:tcPr>
+          <w:p>
+            <w:r>
+              <w:rPr>
+                <w:sz w:val="13"/>
+              </w:rPr>
+              <w:t>4 vs 5 (positions Intima-medium vs Whole)</w:t>
+            </w:r>
+          </w:p>
+        </w:tc>
+        <w:tc>
+          <w:tcPr>
+            <w:tcW w:type="dxa" w:w="1045"/>
+          </w:tcPr>
+          <w:p>
+            <w:r>
+              <w:rPr>
+                <w:sz w:val="13"/>
+              </w:rPr>
+              <w:t>none (Position confounded with stage)</w:t>
+            </w:r>
+          </w:p>
+        </w:tc>
+        <w:tc>
+          <w:tcPr>
+            <w:tcW w:type="dxa" w:w="1045"/>
+          </w:tcPr>
+          <w:p>
+            <w:r>
+              <w:rPr>
+                <w:sz w:val="13"/>
+              </w:rPr>
+              <w:t>CI excludes 0</w:t>
+            </w:r>
+          </w:p>
+        </w:tc>
+        <w:tc>
+          <w:tcPr>
+            <w:tcW w:type="dxa" w:w="1045"/>
+          </w:tcPr>
+          <w:p>
+            <w:r>
+              <w:rPr>
+                <w:sz w:val="13"/>
+              </w:rPr>
+              <w:t>limited precision; sampling position differs between stages</w:t>
+            </w:r>
+          </w:p>
+        </w:tc>
+      </w:tr>
+      <w:tr>
+        <w:tc>
+          <w:tcPr>
+            <w:tcW w:type="dxa" w:w="1045"/>
+          </w:tcPr>
+          <w:p>
+            <w:r>
+              <w:rPr>
+                <w:sz w:val="13"/>
+              </w:rPr>
+              <w:t>3. Stage: within-cohort stages (estimation only)</w:t>
+            </w:r>
+          </w:p>
+        </w:tc>
+        <w:tc>
+          <w:tcPr>
+            <w:tcW w:type="dxa" w:w="1045"/>
+          </w:tcPr>
+          <w:p>
+            <w:r>
+              <w:rPr>
+                <w:sz w:val="13"/>
+              </w:rPr>
+              <w:t>GSE222318</w:t>
+            </w:r>
+          </w:p>
+        </w:tc>
+        <w:tc>
+          <w:tcPr>
+            <w:tcW w:type="dxa" w:w="1045"/>
+          </w:tcPr>
+          <w:p>
+            <w:r>
+              <w:rPr>
+                <w:sz w:val="13"/>
+              </w:rPr>
+              <w:t>acute vs control</w:t>
+            </w:r>
+          </w:p>
+        </w:tc>
+        <w:tc>
+          <w:tcPr>
+            <w:tcW w:type="dxa" w:w="1045"/>
+          </w:tcPr>
+          <w:p>
+            <w:r>
+              <w:rPr>
+                <w:sz w:val="13"/>
+              </w:rPr>
+              <w:t>I</w:t>
+            </w:r>
+          </w:p>
+        </w:tc>
+        <w:tc>
+          <w:tcPr>
+            <w:tcW w:type="dxa" w:w="1045"/>
+          </w:tcPr>
+          <w:p>
+            <w:r>
+              <w:rPr>
+                <w:sz w:val="13"/>
+              </w:rPr>
+              <w:t>-0.23 [-2.45, 0.95]</w:t>
+            </w:r>
+          </w:p>
+        </w:tc>
+        <w:tc>
+          <w:tcPr>
+            <w:tcW w:type="dxa" w:w="1045"/>
+          </w:tcPr>
+          <w:p>
+            <w:r>
+              <w:rPr>
+                <w:sz w:val="13"/>
+              </w:rPr>
+              <w:t>4 vs 5 (positions Intima-medium vs Whole)</w:t>
+            </w:r>
+          </w:p>
+        </w:tc>
+        <w:tc>
+          <w:tcPr>
+            <w:tcW w:type="dxa" w:w="1045"/>
+          </w:tcPr>
+          <w:p>
+            <w:r>
+              <w:rPr>
+                <w:sz w:val="13"/>
+              </w:rPr>
+              <w:t>none (Position confounded with stage)</w:t>
+            </w:r>
+          </w:p>
+        </w:tc>
+        <w:tc>
+          <w:tcPr>
+            <w:tcW w:type="dxa" w:w="1045"/>
+          </w:tcPr>
+          <w:p>
+            <w:r>
+              <w:rPr>
+                <w:sz w:val="13"/>
+              </w:rPr>
+              <w:t>CI includes 0</w:t>
+            </w:r>
+          </w:p>
+        </w:tc>
+        <w:tc>
+          <w:tcPr>
+            <w:tcW w:type="dxa" w:w="1045"/>
+          </w:tcPr>
+          <w:p>
+            <w:r>
+              <w:rPr>
+                <w:sz w:val="13"/>
+              </w:rPr>
+              <w:t>limited precision; sampling position differs between stages</w:t>
+            </w:r>
+          </w:p>
+        </w:tc>
+      </w:tr>
+      <w:tr>
+        <w:tc>
+          <w:tcPr>
+            <w:tcW w:type="dxa" w:w="1045"/>
+          </w:tcPr>
+          <w:p>
+            <w:r>
+              <w:rPr>
+                <w:sz w:val="13"/>
+              </w:rPr>
+              <w:t>3. Stage: within-cohort stages (estimation only)</w:t>
+            </w:r>
+          </w:p>
+        </w:tc>
+        <w:tc>
+          <w:tcPr>
+            <w:tcW w:type="dxa" w:w="1045"/>
+          </w:tcPr>
+          <w:p>
+            <w:r>
+              <w:rPr>
+                <w:sz w:val="13"/>
+              </w:rPr>
+              <w:t>GSE222318</w:t>
+            </w:r>
+          </w:p>
+        </w:tc>
+        <w:tc>
+          <w:tcPr>
+            <w:tcW w:type="dxa" w:w="1045"/>
+          </w:tcPr>
+          <w:p>
+            <w:r>
+              <w:rPr>
+                <w:sz w:val="13"/>
+              </w:rPr>
+              <w:t>acute vs control</w:t>
+            </w:r>
+          </w:p>
+        </w:tc>
+        <w:tc>
+          <w:tcPr>
+            <w:tcW w:type="dxa" w:w="1045"/>
+          </w:tcPr>
+          <w:p>
+            <w:r>
+              <w:rPr>
+                <w:sz w:val="13"/>
+              </w:rPr>
+              <w:t>R</w:t>
+            </w:r>
+          </w:p>
+        </w:tc>
+        <w:tc>
+          <w:tcPr>
+            <w:tcW w:type="dxa" w:w="1045"/>
+          </w:tcPr>
+          <w:p>
+            <w:r>
+              <w:rPr>
+                <w:sz w:val="13"/>
+              </w:rPr>
+              <w:t>-0.80 [-3.54, 0.34]</w:t>
+            </w:r>
+          </w:p>
+        </w:tc>
+        <w:tc>
+          <w:tcPr>
+            <w:tcW w:type="dxa" w:w="1045"/>
+          </w:tcPr>
+          <w:p>
+            <w:r>
+              <w:rPr>
+                <w:sz w:val="13"/>
+              </w:rPr>
+              <w:t>4 vs 5 (positions Intima-medium vs Whole)</w:t>
+            </w:r>
+          </w:p>
+        </w:tc>
+        <w:tc>
+          <w:tcPr>
+            <w:tcW w:type="dxa" w:w="1045"/>
+          </w:tcPr>
+          <w:p>
+            <w:r>
+              <w:rPr>
+                <w:sz w:val="13"/>
+              </w:rPr>
+              <w:t>none (Position confounded with stage)</w:t>
+            </w:r>
+          </w:p>
+        </w:tc>
+        <w:tc>
+          <w:tcPr>
+            <w:tcW w:type="dxa" w:w="1045"/>
+          </w:tcPr>
+          <w:p>
+            <w:r>
+              <w:rPr>
+                <w:sz w:val="13"/>
+              </w:rPr>
+              <w:t>CI includes 0</w:t>
+            </w:r>
+          </w:p>
+        </w:tc>
+        <w:tc>
+          <w:tcPr>
+            <w:tcW w:type="dxa" w:w="1045"/>
+          </w:tcPr>
+          <w:p>
+            <w:r>
+              <w:rPr>
+                <w:sz w:val="13"/>
+              </w:rPr>
+              <w:t>limited precision; sampling position differs between stages</w:t>
+            </w:r>
+          </w:p>
+        </w:tc>
+      </w:tr>
+      <w:tr>
+        <w:tc>
+          <w:tcPr>
+            <w:tcW w:type="dxa" w:w="1045"/>
+          </w:tcPr>
+          <w:p>
+            <w:r>
+              <w:rPr>
+                <w:sz w:val="13"/>
+              </w:rPr>
+              <w:t>3. Stage: within-cohort stages (estimation only)</w:t>
+            </w:r>
+          </w:p>
+        </w:tc>
+        <w:tc>
+          <w:tcPr>
+            <w:tcW w:type="dxa" w:w="1045"/>
+          </w:tcPr>
+          <w:p>
+            <w:r>
+              <w:rPr>
+                <w:sz w:val="13"/>
+              </w:rPr>
+              <w:t>GSE222318</w:t>
+            </w:r>
+          </w:p>
+        </w:tc>
+        <w:tc>
+          <w:tcPr>
+            <w:tcW w:type="dxa" w:w="1045"/>
+          </w:tcPr>
+          <w:p>
+            <w:r>
+              <w:rPr>
+                <w:sz w:val="13"/>
+              </w:rPr>
+              <w:t>subacute vs control</w:t>
+            </w:r>
+          </w:p>
+        </w:tc>
+        <w:tc>
+          <w:tcPr>
+            <w:tcW w:type="dxa" w:w="1045"/>
+          </w:tcPr>
+          <w:p>
+            <w:r>
+              <w:rPr>
+                <w:sz w:val="13"/>
+              </w:rPr>
+              <w:t>C</w:t>
+            </w:r>
+          </w:p>
+        </w:tc>
+        <w:tc>
+          <w:tcPr>
+            <w:tcW w:type="dxa" w:w="1045"/>
+          </w:tcPr>
+          <w:p>
+            <w:r>
+              <w:rPr>
+                <w:sz w:val="13"/>
+              </w:rPr>
+              <w:t>+0.64 [-0.42, 8.37]</w:t>
+            </w:r>
+          </w:p>
+        </w:tc>
+        <w:tc>
+          <w:tcPr>
+            <w:tcW w:type="dxa" w:w="1045"/>
+          </w:tcPr>
+          <w:p>
+            <w:r>
+              <w:rPr>
+                <w:sz w:val="13"/>
+              </w:rPr>
+              <w:t>2 vs 5 (positions Intima-medium vs Whole)</w:t>
+            </w:r>
+          </w:p>
+        </w:tc>
+        <w:tc>
+          <w:tcPr>
+            <w:tcW w:type="dxa" w:w="1045"/>
+          </w:tcPr>
+          <w:p>
+            <w:r>
+              <w:rPr>
+                <w:sz w:val="13"/>
+              </w:rPr>
+              <w:t>none (Position confounded with stage)</w:t>
+            </w:r>
+          </w:p>
+        </w:tc>
+        <w:tc>
+          <w:tcPr>
+            <w:tcW w:type="dxa" w:w="1045"/>
+          </w:tcPr>
+          <w:p>
+            <w:r>
+              <w:rPr>
+                <w:sz w:val="13"/>
+              </w:rPr>
+              <w:t>CI includes 0</w:t>
+            </w:r>
+          </w:p>
+        </w:tc>
+        <w:tc>
+          <w:tcPr>
+            <w:tcW w:type="dxa" w:w="1045"/>
+          </w:tcPr>
+          <w:p>
+            <w:r>
+              <w:rPr>
+                <w:sz w:val="13"/>
+              </w:rPr>
+              <w:t>limited precision; sampling position differs between stages</w:t>
+            </w:r>
+          </w:p>
+        </w:tc>
+      </w:tr>
+      <w:tr>
+        <w:tc>
+          <w:tcPr>
+            <w:tcW w:type="dxa" w:w="1045"/>
+          </w:tcPr>
+          <w:p>
+            <w:r>
+              <w:rPr>
+                <w:sz w:val="13"/>
+              </w:rPr>
+              <w:t>3. Stage: within-cohort stages (estimation only)</w:t>
+            </w:r>
+          </w:p>
+        </w:tc>
+        <w:tc>
+          <w:tcPr>
+            <w:tcW w:type="dxa" w:w="1045"/>
+          </w:tcPr>
+          <w:p>
+            <w:r>
+              <w:rPr>
+                <w:sz w:val="13"/>
+              </w:rPr>
+              <w:t>GSE222318</w:t>
+            </w:r>
+          </w:p>
+        </w:tc>
+        <w:tc>
+          <w:tcPr>
+            <w:tcW w:type="dxa" w:w="1045"/>
+          </w:tcPr>
+          <w:p>
+            <w:r>
+              <w:rPr>
+                <w:sz w:val="13"/>
+              </w:rPr>
+              <w:t>subacute vs control</w:t>
+            </w:r>
+          </w:p>
+        </w:tc>
+        <w:tc>
+          <w:tcPr>
+            <w:tcW w:type="dxa" w:w="1045"/>
+          </w:tcPr>
+          <w:p>
+            <w:r>
+              <w:rPr>
+                <w:sz w:val="13"/>
+              </w:rPr>
+              <w:t>I</w:t>
+            </w:r>
+          </w:p>
+        </w:tc>
+        <w:tc>
+          <w:tcPr>
+            <w:tcW w:type="dxa" w:w="1045"/>
+          </w:tcPr>
+          <w:p>
+            <w:r>
+              <w:rPr>
+                <w:sz w:val="13"/>
+              </w:rPr>
+              <w:t>+0.13 [-2.00, 1.03]</w:t>
+            </w:r>
+          </w:p>
+        </w:tc>
+        <w:tc>
+          <w:tcPr>
+            <w:tcW w:type="dxa" w:w="1045"/>
+          </w:tcPr>
+          <w:p>
+            <w:r>
+              <w:rPr>
+                <w:sz w:val="13"/>
+              </w:rPr>
+              <w:t>2 vs 5 (positions Intima-medium vs Whole)</w:t>
+            </w:r>
+          </w:p>
+        </w:tc>
+        <w:tc>
+          <w:tcPr>
+            <w:tcW w:type="dxa" w:w="1045"/>
+          </w:tcPr>
+          <w:p>
+            <w:r>
+              <w:rPr>
+                <w:sz w:val="13"/>
+              </w:rPr>
+              <w:t>none (Position confounded with stage)</w:t>
+            </w:r>
+          </w:p>
+        </w:tc>
+        <w:tc>
+          <w:tcPr>
+            <w:tcW w:type="dxa" w:w="1045"/>
+          </w:tcPr>
+          <w:p>
+            <w:r>
+              <w:rPr>
+                <w:sz w:val="13"/>
+              </w:rPr>
+              <w:t>CI includes 0</w:t>
+            </w:r>
+          </w:p>
+        </w:tc>
+        <w:tc>
+          <w:tcPr>
+            <w:tcW w:type="dxa" w:w="1045"/>
+          </w:tcPr>
+          <w:p>
+            <w:r>
+              <w:rPr>
+                <w:sz w:val="13"/>
+              </w:rPr>
+              <w:t>limited precision; sampling position differs between stages</w:t>
+            </w:r>
+          </w:p>
+        </w:tc>
+      </w:tr>
+      <w:tr>
+        <w:tc>
+          <w:tcPr>
+            <w:tcW w:type="dxa" w:w="1045"/>
+          </w:tcPr>
+          <w:p>
+            <w:r>
+              <w:rPr>
+                <w:sz w:val="13"/>
+              </w:rPr>
+              <w:t>3. Stage: within-cohort stages (estimation only)</w:t>
+            </w:r>
+          </w:p>
+        </w:tc>
+        <w:tc>
+          <w:tcPr>
+            <w:tcW w:type="dxa" w:w="1045"/>
+          </w:tcPr>
+          <w:p>
+            <w:r>
+              <w:rPr>
+                <w:sz w:val="13"/>
+              </w:rPr>
+              <w:t>GSE222318</w:t>
+            </w:r>
+          </w:p>
+        </w:tc>
+        <w:tc>
+          <w:tcPr>
+            <w:tcW w:type="dxa" w:w="1045"/>
+          </w:tcPr>
+          <w:p>
+            <w:r>
+              <w:rPr>
+                <w:sz w:val="13"/>
+              </w:rPr>
+              <w:t>subacute vs control</w:t>
+            </w:r>
+          </w:p>
+        </w:tc>
+        <w:tc>
+          <w:tcPr>
+            <w:tcW w:type="dxa" w:w="1045"/>
+          </w:tcPr>
+          <w:p>
+            <w:r>
+              <w:rPr>
+                <w:sz w:val="13"/>
+              </w:rPr>
+              <w:t>R</w:t>
+            </w:r>
+          </w:p>
+        </w:tc>
+        <w:tc>
+          <w:tcPr>
+            <w:tcW w:type="dxa" w:w="1045"/>
+          </w:tcPr>
+          <w:p>
+            <w:r>
+              <w:rPr>
+                <w:sz w:val="13"/>
+              </w:rPr>
+              <w:t>+0.37 [-0.71, 1.57]</w:t>
+            </w:r>
+          </w:p>
+        </w:tc>
+        <w:tc>
+          <w:tcPr>
+            <w:tcW w:type="dxa" w:w="1045"/>
+          </w:tcPr>
+          <w:p>
+            <w:r>
+              <w:rPr>
+                <w:sz w:val="13"/>
+              </w:rPr>
+              <w:t>2 vs 5 (positions Intima-medium vs Whole)</w:t>
+            </w:r>
+          </w:p>
+        </w:tc>
+        <w:tc>
+          <w:tcPr>
+            <w:tcW w:type="dxa" w:w="1045"/>
+          </w:tcPr>
+          <w:p>
+            <w:r>
+              <w:rPr>
+                <w:sz w:val="13"/>
+              </w:rPr>
+              <w:t>none (Position confounded with stage)</w:t>
+            </w:r>
+          </w:p>
+        </w:tc>
+        <w:tc>
+          <w:tcPr>
+            <w:tcW w:type="dxa" w:w="1045"/>
+          </w:tcPr>
+          <w:p>
+            <w:r>
+              <w:rPr>
+                <w:sz w:val="13"/>
+              </w:rPr>
+              <w:t>CI includes 0</w:t>
+            </w:r>
+          </w:p>
+        </w:tc>
+        <w:tc>
+          <w:tcPr>
+            <w:tcW w:type="dxa" w:w="1045"/>
+          </w:tcPr>
+          <w:p>
+            <w:r>
+              <w:rPr>
+                <w:sz w:val="13"/>
+              </w:rPr>
+              <w:t>limited precision; sampling position differs between stages</w:t>
+            </w:r>
+          </w:p>
+        </w:tc>
+      </w:tr>
+      <w:tr>
+        <w:tc>
+          <w:tcPr>
+            <w:tcW w:type="dxa" w:w="1045"/>
+          </w:tcPr>
+          <w:p>
+            <w:r>
+              <w:rPr>
+                <w:sz w:val="13"/>
+              </w:rPr>
+              <w:t>3. Stage: within-cohort stages (estimation only)</w:t>
+            </w:r>
+          </w:p>
+        </w:tc>
+        <w:tc>
+          <w:tcPr>
+            <w:tcW w:type="dxa" w:w="1045"/>
+          </w:tcPr>
+          <w:p>
+            <w:r>
+              <w:rPr>
+                <w:sz w:val="13"/>
+              </w:rPr>
+              <w:t>GSE222318</w:t>
+            </w:r>
+          </w:p>
+        </w:tc>
+        <w:tc>
+          <w:tcPr>
+            <w:tcW w:type="dxa" w:w="1045"/>
+          </w:tcPr>
+          <w:p>
+            <w:r>
+              <w:rPr>
+                <w:sz w:val="13"/>
+              </w:rPr>
+              <w:t>chronic vs control</w:t>
+            </w:r>
+          </w:p>
+        </w:tc>
+        <w:tc>
+          <w:tcPr>
+            <w:tcW w:type="dxa" w:w="1045"/>
+          </w:tcPr>
+          <w:p>
+            <w:r>
+              <w:rPr>
+                <w:sz w:val="13"/>
+              </w:rPr>
+              <w:t>C</w:t>
+            </w:r>
+          </w:p>
+        </w:tc>
+        <w:tc>
+          <w:tcPr>
+            <w:tcW w:type="dxa" w:w="1045"/>
+          </w:tcPr>
+          <w:p>
+            <w:r>
+              <w:rPr>
+                <w:sz w:val="13"/>
+              </w:rPr>
+              <w:t>+1.09 [-0.59, 8.55]</w:t>
+            </w:r>
+          </w:p>
+        </w:tc>
+        <w:tc>
+          <w:tcPr>
+            <w:tcW w:type="dxa" w:w="1045"/>
+          </w:tcPr>
+          <w:p>
+            <w:r>
+              <w:rPr>
+                <w:sz w:val="13"/>
+              </w:rPr>
+              <w:t>2 vs 5 (positions Whole vs Whole)</w:t>
+            </w:r>
+          </w:p>
+        </w:tc>
+        <w:tc>
+          <w:tcPr>
+            <w:tcW w:type="dxa" w:w="1045"/>
+          </w:tcPr>
+          <w:p>
+            <w:r>
+              <w:rPr>
+                <w:sz w:val="13"/>
+              </w:rPr>
+              <w:t>none (Position confounded with stage)</w:t>
+            </w:r>
+          </w:p>
+        </w:tc>
+        <w:tc>
+          <w:tcPr>
+            <w:tcW w:type="dxa" w:w="1045"/>
+          </w:tcPr>
+          <w:p>
+            <w:r>
+              <w:rPr>
+                <w:sz w:val="13"/>
+              </w:rPr>
+              <w:t>CI includes 0</w:t>
+            </w:r>
+          </w:p>
+        </w:tc>
+        <w:tc>
+          <w:tcPr>
+            <w:tcW w:type="dxa" w:w="1045"/>
+          </w:tcPr>
+          <w:p>
+            <w:r>
+              <w:rPr>
+                <w:sz w:val="13"/>
+              </w:rPr>
+              <w:t>limited precision; sampling position differs between stages</w:t>
+            </w:r>
+          </w:p>
+        </w:tc>
+      </w:tr>
+      <w:tr>
+        <w:tc>
+          <w:tcPr>
+            <w:tcW w:type="dxa" w:w="1045"/>
+          </w:tcPr>
+          <w:p>
+            <w:r>
+              <w:rPr>
+                <w:sz w:val="13"/>
+              </w:rPr>
+              <w:t>3. Stage: within-cohort stages (estimation only)</w:t>
+            </w:r>
+          </w:p>
+        </w:tc>
+        <w:tc>
+          <w:tcPr>
+            <w:tcW w:type="dxa" w:w="1045"/>
+          </w:tcPr>
+          <w:p>
+            <w:r>
+              <w:rPr>
+                <w:sz w:val="13"/>
+              </w:rPr>
+              <w:t>GSE222318</w:t>
+            </w:r>
+          </w:p>
+        </w:tc>
+        <w:tc>
+          <w:tcPr>
+            <w:tcW w:type="dxa" w:w="1045"/>
+          </w:tcPr>
+          <w:p>
+            <w:r>
+              <w:rPr>
+                <w:sz w:val="13"/>
+              </w:rPr>
+              <w:t>chronic vs control</w:t>
+            </w:r>
+          </w:p>
+        </w:tc>
+        <w:tc>
+          <w:tcPr>
+            <w:tcW w:type="dxa" w:w="1045"/>
+          </w:tcPr>
+          <w:p>
+            <w:r>
+              <w:rPr>
+                <w:sz w:val="13"/>
+              </w:rPr>
+              <w:t>I</w:t>
+            </w:r>
+          </w:p>
+        </w:tc>
+        <w:tc>
+          <w:tcPr>
+            <w:tcW w:type="dxa" w:w="1045"/>
+          </w:tcPr>
+          <w:p>
+            <w:r>
+              <w:rPr>
+                <w:sz w:val="13"/>
+              </w:rPr>
+              <w:t>-0.27 [-3.08, 2.12]</w:t>
+            </w:r>
+          </w:p>
+        </w:tc>
+        <w:tc>
+          <w:tcPr>
+            <w:tcW w:type="dxa" w:w="1045"/>
+          </w:tcPr>
+          <w:p>
+            <w:r>
+              <w:rPr>
+                <w:sz w:val="13"/>
+              </w:rPr>
+              <w:t>2 vs 5 (positions Whole vs Whole)</w:t>
+            </w:r>
+          </w:p>
+        </w:tc>
+        <w:tc>
+          <w:tcPr>
+            <w:tcW w:type="dxa" w:w="1045"/>
+          </w:tcPr>
+          <w:p>
+            <w:r>
+              <w:rPr>
+                <w:sz w:val="13"/>
+              </w:rPr>
+              <w:t>none (Position confounded with stage)</w:t>
+            </w:r>
+          </w:p>
+        </w:tc>
+        <w:tc>
+          <w:tcPr>
+            <w:tcW w:type="dxa" w:w="1045"/>
+          </w:tcPr>
+          <w:p>
+            <w:r>
+              <w:rPr>
+                <w:sz w:val="13"/>
+              </w:rPr>
+              <w:t>CI includes 0</w:t>
+            </w:r>
+          </w:p>
+        </w:tc>
+        <w:tc>
+          <w:tcPr>
+            <w:tcW w:type="dxa" w:w="1045"/>
+          </w:tcPr>
+          <w:p>
+            <w:r>
+              <w:rPr>
+                <w:sz w:val="13"/>
+              </w:rPr>
+              <w:t>limited precision; sampling position differs between stages</w:t>
+            </w:r>
+          </w:p>
+        </w:tc>
+      </w:tr>
+      <w:tr>
+        <w:tc>
+          <w:tcPr>
+            <w:tcW w:type="dxa" w:w="1045"/>
+          </w:tcPr>
+          <w:p>
+            <w:r>
+              <w:rPr>
+                <w:sz w:val="13"/>
+              </w:rPr>
+              <w:t>3. Stage: within-cohort stages (estimation only)</w:t>
+            </w:r>
+          </w:p>
+        </w:tc>
+        <w:tc>
+          <w:tcPr>
+            <w:tcW w:type="dxa" w:w="1045"/>
+          </w:tcPr>
+          <w:p>
+            <w:r>
+              <w:rPr>
+                <w:sz w:val="13"/>
+              </w:rPr>
+              <w:t>GSE222318</w:t>
+            </w:r>
+          </w:p>
+        </w:tc>
+        <w:tc>
+          <w:tcPr>
+            <w:tcW w:type="dxa" w:w="1045"/>
+          </w:tcPr>
+          <w:p>
+            <w:r>
+              <w:rPr>
+                <w:sz w:val="13"/>
+              </w:rPr>
+              <w:t>chronic vs control</w:t>
+            </w:r>
+          </w:p>
+        </w:tc>
+        <w:tc>
+          <w:tcPr>
+            <w:tcW w:type="dxa" w:w="1045"/>
+          </w:tcPr>
+          <w:p>
+            <w:r>
+              <w:rPr>
+                <w:sz w:val="13"/>
+              </w:rPr>
+              <w:t>R</w:t>
+            </w:r>
+          </w:p>
+        </w:tc>
+        <w:tc>
+          <w:tcPr>
+            <w:tcW w:type="dxa" w:w="1045"/>
+          </w:tcPr>
+          <w:p>
+            <w:r>
+              <w:rPr>
+                <w:sz w:val="13"/>
+              </w:rPr>
+              <w:t>+0.21 [-2.71, 4.41]</w:t>
+            </w:r>
+          </w:p>
+        </w:tc>
+        <w:tc>
+          <w:tcPr>
+            <w:tcW w:type="dxa" w:w="1045"/>
+          </w:tcPr>
+          <w:p>
+            <w:r>
+              <w:rPr>
+                <w:sz w:val="13"/>
+              </w:rPr>
+              <w:t>2 vs 5 (positions Whole vs Whole)</w:t>
+            </w:r>
+          </w:p>
+        </w:tc>
+        <w:tc>
+          <w:tcPr>
+            <w:tcW w:type="dxa" w:w="1045"/>
+          </w:tcPr>
+          <w:p>
+            <w:r>
+              <w:rPr>
+                <w:sz w:val="13"/>
+              </w:rPr>
+              <w:t>none (Position confounded with stage)</w:t>
+            </w:r>
+          </w:p>
+        </w:tc>
+        <w:tc>
+          <w:tcPr>
+            <w:tcW w:type="dxa" w:w="1045"/>
+          </w:tcPr>
+          <w:p>
+            <w:r>
+              <w:rPr>
+                <w:sz w:val="13"/>
+              </w:rPr>
+              <w:t>CI includes 0</w:t>
+            </w:r>
+          </w:p>
+        </w:tc>
+        <w:tc>
+          <w:tcPr>
+            <w:tcW w:type="dxa" w:w="1045"/>
+          </w:tcPr>
+          <w:p>
+            <w:r>
+              <w:rPr>
+                <w:sz w:val="13"/>
+              </w:rPr>
+              <w:t>limited precision; sampling position differs between stages</w:t>
+            </w:r>
+          </w:p>
+        </w:tc>
+      </w:tr>
+      <w:tr>
+        <w:tc>
+          <w:tcPr>
+            <w:tcW w:type="dxa" w:w="1045"/>
+          </w:tcPr>
+          <w:p>
+            <w:r>
+              <w:rPr>
+                <w:sz w:val="13"/>
+              </w:rPr>
+              <w:t>3. Stage: within-cohort stages (estimation only)</w:t>
+            </w:r>
+          </w:p>
+        </w:tc>
+        <w:tc>
+          <w:tcPr>
+            <w:tcW w:type="dxa" w:w="1045"/>
+          </w:tcPr>
+          <w:p>
+            <w:r>
+              <w:rPr>
+                <w:sz w:val="13"/>
+              </w:rPr>
+              <w:t>GSE222318</w:t>
+            </w:r>
+          </w:p>
+        </w:tc>
+        <w:tc>
+          <w:tcPr>
+            <w:tcW w:type="dxa" w:w="1045"/>
+          </w:tcPr>
+          <w:p>
+            <w:r>
+              <w:rPr>
+                <w:sz w:val="13"/>
+              </w:rPr>
+              <w:t>acute vs nonacute</w:t>
+            </w:r>
+          </w:p>
+        </w:tc>
+        <w:tc>
+          <w:tcPr>
+            <w:tcW w:type="dxa" w:w="1045"/>
+          </w:tcPr>
+          <w:p>
+            <w:r>
+              <w:rPr>
+                <w:sz w:val="13"/>
+              </w:rPr>
+              <w:t>C</w:t>
+            </w:r>
+          </w:p>
+        </w:tc>
+        <w:tc>
+          <w:tcPr>
+            <w:tcW w:type="dxa" w:w="1045"/>
+          </w:tcPr>
+          <w:p>
+            <w:r>
+              <w:rPr>
+                <w:sz w:val="13"/>
+              </w:rPr>
+              <w:t>-1.86 [-7.63, -1.37]</w:t>
+            </w:r>
+          </w:p>
+        </w:tc>
+        <w:tc>
+          <w:tcPr>
+            <w:tcW w:type="dxa" w:w="1045"/>
+          </w:tcPr>
+          <w:p>
+            <w:r>
+              <w:rPr>
+                <w:sz w:val="13"/>
+              </w:rPr>
+              <w:t>4 vs 4 (positions Intima-medium vs Intima-medium/Whole)</w:t>
+            </w:r>
+          </w:p>
+        </w:tc>
+        <w:tc>
+          <w:tcPr>
+            <w:tcW w:type="dxa" w:w="1045"/>
+          </w:tcPr>
+          <w:p>
+            <w:r>
+              <w:rPr>
+                <w:sz w:val="13"/>
+              </w:rPr>
+              <w:t>none (Position confounded with stage)</w:t>
+            </w:r>
+          </w:p>
+        </w:tc>
+        <w:tc>
+          <w:tcPr>
+            <w:tcW w:type="dxa" w:w="1045"/>
+          </w:tcPr>
+          <w:p>
+            <w:r>
+              <w:rPr>
+                <w:sz w:val="13"/>
+              </w:rPr>
+              <w:t>CI excludes 0</w:t>
+            </w:r>
+          </w:p>
+        </w:tc>
+        <w:tc>
+          <w:tcPr>
+            <w:tcW w:type="dxa" w:w="1045"/>
+          </w:tcPr>
+          <w:p>
+            <w:r>
+              <w:rPr>
+                <w:sz w:val="13"/>
+              </w:rPr>
+              <w:t>limited precision; sampling position differs between stages</w:t>
+            </w:r>
+          </w:p>
+        </w:tc>
+      </w:tr>
+      <w:tr>
+        <w:tc>
+          <w:tcPr>
+            <w:tcW w:type="dxa" w:w="1045"/>
+          </w:tcPr>
+          <w:p>
+            <w:r>
+              <w:rPr>
+                <w:sz w:val="13"/>
+              </w:rPr>
+              <w:t>3. Stage: within-cohort stages (estimation only)</w:t>
+            </w:r>
+          </w:p>
+        </w:tc>
+        <w:tc>
+          <w:tcPr>
+            <w:tcW w:type="dxa" w:w="1045"/>
+          </w:tcPr>
+          <w:p>
+            <w:r>
+              <w:rPr>
+                <w:sz w:val="13"/>
+              </w:rPr>
+              <w:t>GSE222318</w:t>
+            </w:r>
+          </w:p>
+        </w:tc>
+        <w:tc>
+          <w:tcPr>
+            <w:tcW w:type="dxa" w:w="1045"/>
+          </w:tcPr>
+          <w:p>
+            <w:r>
+              <w:rPr>
+                <w:sz w:val="13"/>
+              </w:rPr>
+              <w:t>acute vs nonacute</w:t>
+            </w:r>
+          </w:p>
+        </w:tc>
+        <w:tc>
+          <w:tcPr>
+            <w:tcW w:type="dxa" w:w="1045"/>
+          </w:tcPr>
+          <w:p>
+            <w:r>
+              <w:rPr>
+                <w:sz w:val="13"/>
+              </w:rPr>
+              <w:t>I</w:t>
+            </w:r>
+          </w:p>
+        </w:tc>
+        <w:tc>
+          <w:tcPr>
+            <w:tcW w:type="dxa" w:w="1045"/>
+          </w:tcPr>
+          <w:p>
+            <w:r>
+              <w:rPr>
+                <w:sz w:val="13"/>
+              </w:rPr>
+              <w:t>-0.09 [-2.56, 1.18]</w:t>
+            </w:r>
+          </w:p>
+        </w:tc>
+        <w:tc>
+          <w:tcPr>
+            <w:tcW w:type="dxa" w:w="1045"/>
+          </w:tcPr>
+          <w:p>
+            <w:r>
+              <w:rPr>
+                <w:sz w:val="13"/>
+              </w:rPr>
+              <w:t>4 vs 4 (positions Intima-medium vs Intima-medium/Whole)</w:t>
+            </w:r>
+          </w:p>
+        </w:tc>
+        <w:tc>
+          <w:tcPr>
+            <w:tcW w:type="dxa" w:w="1045"/>
+          </w:tcPr>
+          <w:p>
+            <w:r>
+              <w:rPr>
+                <w:sz w:val="13"/>
+              </w:rPr>
+              <w:t>none (Position confounded with stage)</w:t>
+            </w:r>
+          </w:p>
+        </w:tc>
+        <w:tc>
+          <w:tcPr>
+            <w:tcW w:type="dxa" w:w="1045"/>
+          </w:tcPr>
+          <w:p>
+            <w:r>
+              <w:rPr>
+                <w:sz w:val="13"/>
+              </w:rPr>
+              <w:t>CI includes 0</w:t>
+            </w:r>
+          </w:p>
+        </w:tc>
+        <w:tc>
+          <w:tcPr>
+            <w:tcW w:type="dxa" w:w="1045"/>
+          </w:tcPr>
+          <w:p>
+            <w:r>
+              <w:rPr>
+                <w:sz w:val="13"/>
+              </w:rPr>
+              <w:t>limited precision; sampling position differs between stages</w:t>
+            </w:r>
+          </w:p>
+        </w:tc>
+      </w:tr>
+      <w:tr>
+        <w:tc>
+          <w:tcPr>
+            <w:tcW w:type="dxa" w:w="1045"/>
+          </w:tcPr>
+          <w:p>
+            <w:r>
+              <w:rPr>
+                <w:sz w:val="13"/>
+              </w:rPr>
+              <w:t>3. Stage: within-cohort stages (estimation only)</w:t>
+            </w:r>
+          </w:p>
+        </w:tc>
+        <w:tc>
+          <w:tcPr>
+            <w:tcW w:type="dxa" w:w="1045"/>
+          </w:tcPr>
+          <w:p>
+            <w:r>
+              <w:rPr>
+                <w:sz w:val="13"/>
+              </w:rPr>
+              <w:t>GSE222318</w:t>
+            </w:r>
+          </w:p>
+        </w:tc>
+        <w:tc>
+          <w:tcPr>
+            <w:tcW w:type="dxa" w:w="1045"/>
+          </w:tcPr>
+          <w:p>
+            <w:r>
+              <w:rPr>
+                <w:sz w:val="13"/>
+              </w:rPr>
+              <w:t>acute vs nonacute</w:t>
+            </w:r>
+          </w:p>
+        </w:tc>
+        <w:tc>
+          <w:tcPr>
+            <w:tcW w:type="dxa" w:w="1045"/>
+          </w:tcPr>
+          <w:p>
+            <w:r>
+              <w:rPr>
+                <w:sz w:val="13"/>
+              </w:rPr>
+              <w:t>R</w:t>
+            </w:r>
+          </w:p>
+        </w:tc>
+        <w:tc>
+          <w:tcPr>
+            <w:tcW w:type="dxa" w:w="1045"/>
+          </w:tcPr>
+          <w:p>
+            <w:r>
+              <w:rPr>
+                <w:sz w:val="13"/>
+              </w:rPr>
+              <w:t>-0.77 [-3.24, 0.34]</w:t>
+            </w:r>
+          </w:p>
+        </w:tc>
+        <w:tc>
+          <w:tcPr>
+            <w:tcW w:type="dxa" w:w="1045"/>
+          </w:tcPr>
+          <w:p>
+            <w:r>
+              <w:rPr>
+                <w:sz w:val="13"/>
+              </w:rPr>
+              <w:t>4 vs 4 (positions Intima-medium vs Intima-medium/Whole)</w:t>
+            </w:r>
+          </w:p>
+        </w:tc>
+        <w:tc>
+          <w:tcPr>
+            <w:tcW w:type="dxa" w:w="1045"/>
+          </w:tcPr>
+          <w:p>
+            <w:r>
+              <w:rPr>
+                <w:sz w:val="13"/>
+              </w:rPr>
+              <w:t>none (Position confounded with stage)</w:t>
+            </w:r>
+          </w:p>
+        </w:tc>
+        <w:tc>
+          <w:tcPr>
+            <w:tcW w:type="dxa" w:w="1045"/>
+          </w:tcPr>
+          <w:p>
+            <w:r>
+              <w:rPr>
+                <w:sz w:val="13"/>
+              </w:rPr>
+              <w:t>CI includes 0</w:t>
+            </w:r>
+          </w:p>
+        </w:tc>
+        <w:tc>
+          <w:tcPr>
+            <w:tcW w:type="dxa" w:w="1045"/>
+          </w:tcPr>
+          <w:p>
+            <w:r>
+              <w:rPr>
+                <w:sz w:val="13"/>
+              </w:rPr>
+              <w:t>limited precision; sampling position differs between stages</w:t>
+            </w:r>
+          </w:p>
+        </w:tc>
+      </w:tr>
+      <w:tr>
+        <w:tc>
+          <w:tcPr>
+            <w:tcW w:type="dxa" w:w="1045"/>
+          </w:tcPr>
+          <w:p>
+            <w:r>
+              <w:rPr>
+                <w:sz w:val="13"/>
+              </w:rPr>
+              <w:t>3. Stage: within-cohort stages (estimation only)</w:t>
+            </w:r>
+          </w:p>
+        </w:tc>
+        <w:tc>
+          <w:tcPr>
+            <w:tcW w:type="dxa" w:w="1045"/>
+          </w:tcPr>
+          <w:p>
+            <w:r>
+              <w:rPr>
+                <w:sz w:val="13"/>
+              </w:rPr>
+              <w:t>GSE222318</w:t>
+            </w:r>
+          </w:p>
+        </w:tc>
+        <w:tc>
+          <w:tcPr>
+            <w:tcW w:type="dxa" w:w="1045"/>
+          </w:tcPr>
+          <w:p>
+            <w:r>
+              <w:rPr>
+                <w:sz w:val="13"/>
+              </w:rPr>
+              <w:t>acute vs subacute samePosition</w:t>
+            </w:r>
+          </w:p>
+        </w:tc>
+        <w:tc>
+          <w:tcPr>
+            <w:tcW w:type="dxa" w:w="1045"/>
+          </w:tcPr>
+          <w:p>
+            <w:r>
+              <w:rPr>
+                <w:sz w:val="13"/>
+              </w:rPr>
+              <w:t>C</w:t>
+            </w:r>
+          </w:p>
+        </w:tc>
+        <w:tc>
+          <w:tcPr>
+            <w:tcW w:type="dxa" w:w="1045"/>
+          </w:tcPr>
+          <w:p>
+            <w:r>
+              <w:rPr>
+                <w:sz w:val="13"/>
+              </w:rPr>
+              <w:t>-2.45 [-26.27, -1.47]</w:t>
+            </w:r>
+          </w:p>
+        </w:tc>
+        <w:tc>
+          <w:tcPr>
+            <w:tcW w:type="dxa" w:w="1045"/>
+          </w:tcPr>
+          <w:p>
+            <w:r>
+              <w:rPr>
+                <w:sz w:val="13"/>
+              </w:rPr>
+              <w:t>4 vs 2 (positions Intima-medium vs Intima-medium)</w:t>
+            </w:r>
+          </w:p>
+        </w:tc>
+        <w:tc>
+          <w:tcPr>
+            <w:tcW w:type="dxa" w:w="1045"/>
+          </w:tcPr>
+          <w:p>
+            <w:r>
+              <w:rPr>
+                <w:sz w:val="13"/>
+              </w:rPr>
+              <w:t>none (Position confounded with stage)</w:t>
+            </w:r>
+          </w:p>
+        </w:tc>
+        <w:tc>
+          <w:tcPr>
+            <w:tcW w:type="dxa" w:w="1045"/>
+          </w:tcPr>
+          <w:p>
+            <w:r>
+              <w:rPr>
+                <w:sz w:val="13"/>
+              </w:rPr>
+              <w:t>CI excludes 0</w:t>
+            </w:r>
+          </w:p>
+        </w:tc>
+        <w:tc>
+          <w:tcPr>
+            <w:tcW w:type="dxa" w:w="1045"/>
+          </w:tcPr>
+          <w:p>
+            <w:r>
+              <w:rPr>
+                <w:sz w:val="13"/>
+              </w:rPr>
+              <w:t>limited precision (same sampling position)</w:t>
+            </w:r>
+          </w:p>
+        </w:tc>
+      </w:tr>
+      <w:tr>
+        <w:tc>
+          <w:tcPr>
+            <w:tcW w:type="dxa" w:w="1045"/>
+          </w:tcPr>
+          <w:p>
+            <w:r>
+              <w:rPr>
+                <w:sz w:val="13"/>
+              </w:rPr>
+              <w:t>3. Stage: within-cohort stages (estimation only)</w:t>
+            </w:r>
+          </w:p>
+        </w:tc>
+        <w:tc>
+          <w:tcPr>
+            <w:tcW w:type="dxa" w:w="1045"/>
+          </w:tcPr>
+          <w:p>
+            <w:r>
+              <w:rPr>
+                <w:sz w:val="13"/>
+              </w:rPr>
+              <w:t>GSE222318</w:t>
+            </w:r>
+          </w:p>
+        </w:tc>
+        <w:tc>
+          <w:tcPr>
+            <w:tcW w:type="dxa" w:w="1045"/>
+          </w:tcPr>
+          <w:p>
+            <w:r>
+              <w:rPr>
+                <w:sz w:val="13"/>
+              </w:rPr>
+              <w:t>acute vs subacute samePosition</w:t>
+            </w:r>
+          </w:p>
+        </w:tc>
+        <w:tc>
+          <w:tcPr>
+            <w:tcW w:type="dxa" w:w="1045"/>
+          </w:tcPr>
+          <w:p>
+            <w:r>
+              <w:rPr>
+                <w:sz w:val="13"/>
+              </w:rPr>
+              <w:t>I</w:t>
+            </w:r>
+          </w:p>
+        </w:tc>
+        <w:tc>
+          <w:tcPr>
+            <w:tcW w:type="dxa" w:w="1045"/>
+          </w:tcPr>
+          <w:p>
+            <w:r>
+              <w:rPr>
+                <w:sz w:val="13"/>
+              </w:rPr>
+              <w:t>-0.33 [-127.36, 0.61]</w:t>
+            </w:r>
+          </w:p>
+        </w:tc>
+        <w:tc>
+          <w:tcPr>
+            <w:tcW w:type="dxa" w:w="1045"/>
+          </w:tcPr>
+          <w:p>
+            <w:r>
+              <w:rPr>
+                <w:sz w:val="13"/>
+              </w:rPr>
+              <w:t>4 vs 2 (positions Intima-medium vs Intima-medium)</w:t>
+            </w:r>
+          </w:p>
+        </w:tc>
+        <w:tc>
+          <w:tcPr>
+            <w:tcW w:type="dxa" w:w="1045"/>
+          </w:tcPr>
+          <w:p>
+            <w:r>
+              <w:rPr>
+                <w:sz w:val="13"/>
+              </w:rPr>
+              <w:t>none (Position confounded with stage)</w:t>
+            </w:r>
+          </w:p>
+        </w:tc>
+        <w:tc>
+          <w:tcPr>
+            <w:tcW w:type="dxa" w:w="1045"/>
+          </w:tcPr>
+          <w:p>
+            <w:r>
+              <w:rPr>
+                <w:sz w:val="13"/>
+              </w:rPr>
+              <w:t>CI includes 0</w:t>
+            </w:r>
+          </w:p>
+        </w:tc>
+        <w:tc>
+          <w:tcPr>
+            <w:tcW w:type="dxa" w:w="1045"/>
+          </w:tcPr>
+          <w:p>
+            <w:r>
+              <w:rPr>
+                <w:sz w:val="13"/>
+              </w:rPr>
+              <w:t>limited precision (same sampling position)</w:t>
+            </w:r>
+          </w:p>
+        </w:tc>
+      </w:tr>
+      <w:tr>
+        <w:tc>
+          <w:tcPr>
+            <w:tcW w:type="dxa" w:w="1045"/>
+          </w:tcPr>
+          <w:p>
+            <w:r>
+              <w:rPr>
+                <w:sz w:val="13"/>
+              </w:rPr>
+              <w:t>3. Stage: within-cohort stages (estimation only)</w:t>
+            </w:r>
+          </w:p>
+        </w:tc>
+        <w:tc>
+          <w:tcPr>
+            <w:tcW w:type="dxa" w:w="1045"/>
+          </w:tcPr>
+          <w:p>
+            <w:r>
+              <w:rPr>
+                <w:sz w:val="13"/>
+              </w:rPr>
+              <w:t>GSE222318</w:t>
+            </w:r>
+          </w:p>
+        </w:tc>
+        <w:tc>
+          <w:tcPr>
+            <w:tcW w:type="dxa" w:w="1045"/>
+          </w:tcPr>
+          <w:p>
+            <w:r>
+              <w:rPr>
+                <w:sz w:val="13"/>
+              </w:rPr>
+              <w:t>acute vs subacute samePosition</w:t>
+            </w:r>
+          </w:p>
+        </w:tc>
+        <w:tc>
+          <w:tcPr>
+            <w:tcW w:type="dxa" w:w="1045"/>
+          </w:tcPr>
+          <w:p>
+            <w:r>
+              <w:rPr>
+                <w:sz w:val="13"/>
+              </w:rPr>
+              <w:t>R</w:t>
+            </w:r>
+          </w:p>
+        </w:tc>
+        <w:tc>
+          <w:tcPr>
+            <w:tcW w:type="dxa" w:w="1045"/>
+          </w:tcPr>
+          <w:p>
+            <w:r>
+              <w:rPr>
+                <w:sz w:val="13"/>
+              </w:rPr>
+              <w:t>-0.97 [-51.78, -0.19]</w:t>
+            </w:r>
+          </w:p>
+        </w:tc>
+        <w:tc>
+          <w:tcPr>
+            <w:tcW w:type="dxa" w:w="1045"/>
+          </w:tcPr>
+          <w:p>
+            <w:r>
+              <w:rPr>
+                <w:sz w:val="13"/>
+              </w:rPr>
+              <w:t>4 vs 2 (positions Intima-medium vs Intima-medium)</w:t>
+            </w:r>
+          </w:p>
+        </w:tc>
+        <w:tc>
+          <w:tcPr>
+            <w:tcW w:type="dxa" w:w="1045"/>
+          </w:tcPr>
+          <w:p>
+            <w:r>
+              <w:rPr>
+                <w:sz w:val="13"/>
+              </w:rPr>
+              <w:t>none (Position confounded with stage)</w:t>
+            </w:r>
+          </w:p>
+        </w:tc>
+        <w:tc>
+          <w:tcPr>
+            <w:tcW w:type="dxa" w:w="1045"/>
+          </w:tcPr>
+          <w:p>
+            <w:r>
+              <w:rPr>
+                <w:sz w:val="13"/>
+              </w:rPr>
+              <w:t>CI excludes 0</w:t>
+            </w:r>
+          </w:p>
+        </w:tc>
+        <w:tc>
+          <w:tcPr>
+            <w:tcW w:type="dxa" w:w="1045"/>
+          </w:tcPr>
+          <w:p>
+            <w:r>
+              <w:rPr>
+                <w:sz w:val="13"/>
+              </w:rPr>
+              <w:t>limited precision (same sampling position)</w:t>
+            </w:r>
+          </w:p>
+        </w:tc>
+      </w:tr>
+      <w:tr>
+        <w:tc>
+          <w:tcPr>
+            <w:tcW w:type="dxa" w:w="1045"/>
+          </w:tcPr>
+          <w:p>
+            <w:r>
+              <w:rPr>
+                <w:sz w:val="13"/>
+              </w:rPr>
               <w:t>4. Within-patient region (paired)</w:t>
             </w:r>
           </w:p>
@@ -9132,7 +11392,7 @@
     </w:p>
     <w:p>
       <w:r>
-        <w:t>Cells from GSE155468 (8 ATAA, 3 control) and GSE213740 (6 TAAD, 3 donor) were quality-filtered (200–6,000 genes, &lt; 20 % mitochondrial reads), down-sampled to ≤ 4,000 cells per sample, normalised, log-transformed and integrated with Harmony on 40 principal components of 2,000 highly variable genes (Scanpy) [29,30]; Leiden clusters were annotated with canonical markers, a doublet-like cluster was removed and 73,755 cells in 12 populations remained (Additional file 4). GSE189795 and GSE222318 were processed with the same pipeline separately. For each dataset, pseudo-bulk profiles were formed per patient and cell type (mean log-normalised expression; patients with &lt; 20 cells of the type were excluded, which removed one ATAA patient from the contractile-SMC analysis of GSE155468), programme scores were computed within cell type across all patients, and disease-versus-control effects were estimated per cell type. A full-pipeline check repeated the primary contractile-SMC test with control-referenced standardisation and permutation of the labels through the whole scoring procedure.</w:t>
+        <w:t>Cells from GSE155468 (8 ATAA, 3 control) and GSE213740 (6 TAAD, 3 donor) were quality-filtered (200–6,000 genes, &lt; 20 % mitochondrial reads), down-sampled to ≤ 4,000 cells per sample, normalised, log-transformed and integrated with Harmony on 40 principal components of 2,000 highly variable genes (Scanpy) [29,30]; Leiden clusters were annotated with canonical markers, a doublet-like cluster was removed and 73,755 cells in 12 populations remained (Additional file 4). GSE189795 and GSE222318 were processed with the same pipeline separately. For each dataset, pseudo-bulk profiles were formed per patient and cell type (mean log-normalised expression; patients with &lt; 20 cells of the type were excluded, which removed one ATAA patient from the contractile-SMC analysis of GSE155468), programme scores were computed within cell type across all patients, and disease-versus-control effects were estimated per cell type. A full-pipeline check repeated the primary contractile-SMC test with control-referenced standardisation and permutation of the labels through the whole scoring procedure. As an exploratory sensitivity analysis addressing cells that may have left the contractile state, the same scores were computed per patient in the whole SMC population (contractile plus modulated SMC; a broader definition adding fibromyocytes) and within modulated SMC, and the per-patient fraction of modulated SMC among captured SMC was compared between groups; captured-cell proportions are subject to dissociation bias and are not tissue cell counts, and none of these comparisons was a primary test (Additional file 4).</w:t>
       </w:r>
     </w:p>
     <w:p>
@@ -9158,7 +11418,7 @@
     </w:p>
     <w:p>
       <w:r>
-        <w:t>To ask whether the bulk programme effects were carried by tissue composition, the disease effect on each Tier 1 score was re-estimated per cohort in a linear model conditioning on three pre-specified control-cell signature scores (contractile SMC, inflammatory myeloid, T cell). Genes shared between an outcome module and any of the three marker sets were removed from the outcome module before scoring; a module with &lt; 5 remaining genes would be recorded as not estimable. Unconditioned and conditioned standardised coefficients were pooled per disease by random effects. This is a sensitivity analysis, not a decomposition into cell-intrinsic and compositional parts.</w:t>
+        <w:t>To ask whether the bulk programme effects were carried by tissue composition, the disease effect on each Tier 1 score was re-estimated per cohort in a linear model conditioning on three pre-specified control-cell signature scores (contractile SMC, inflammatory myeloid, T cell). Genes shared between an outcome module and any of the three marker sets were removed from the outcome module before scoring; a module with &lt; 5 remaining genes would be recorded as not estimable. Unconditioned and conditioned standardised coefficients, with their OLS standard errors, were pooled per disease by random effects; a conditioned effect was recorded as retained when it kept the sign of the unconditioned effect and its pooled |coefficient/SE| exceeded 1.96. This is a sensitivity analysis, not a decomposition into cell-intrinsic and compositional parts, and the three scores are expression-based proxies rather than a complete measurement of composition.</w:t>
       </w:r>
     </w:p>
     <w:p>
@@ -9319,7 +11579,7 @@
     </w:p>
     <w:p>
       <w:r>
-        <w:t>With the Tier 1 scores (Fig. 2a–c; Table 2), the contractile programme C was reduced in every TAAD cohort (g −1.33 to −2.68; pooled −2.11, 95 % CI −2.68 to −1.54; I² 0 %) but not consistently in ATAA (two of four cohorts negative; pooled −0.34, −0.94 to 0.25). The difference between diseases was −1.77 (−2.59 to −0.94; Holm P &lt; 0.001; F1 primary). The injury composite I was raised in five of six TAAD cohorts (pooled +1.75, 0.73 to 2.77) and in all four ATAA cohorts to a smaller degree (+0.56, −0.06 to 1.18); the difference (+1.19, 0.00 to 2.39) was borderline (P = 0.050; Holm P = 0.10). The relative state R = I + C lay close to zero in every cohort (−0.62 to +0.96) and did not differ between diseases (+0.20 vs +0.24; difference −0.04, −0.82 to 0.74; P = 0.92). In the plane of C against I, the TAAD cohorts lay far from the origin along the line I = −C, on which R is unchanged, and the ATAA cohorts lay near the origin on the same line (Fig. 6a).</w:t>
+        <w:t>With the Tier 1 scores (Fig. 2a–c; Table 2), the contractile programme C was reduced in every TAAD cohort (g −1.33 to −2.68; pooled −2.11, 95 % CI −2.68 to −1.54; I² 0 %) but not consistently in ATAA (two of four cohorts negative; pooled −0.34, −0.94 to 0.25). The difference between diseases was −1.77 (−2.59 to −0.94; Holm P &lt; 0.001; F1 primary). The injury composite I was raised in five of six TAAD cohorts (pooled +1.75, 0.73 to 2.77) and in all four ATAA cohorts to a smaller degree (+0.56, −0.06 to 1.18); the difference (+1.19, 0.00 to 2.39) was borderline (P = 0.050; Holm P = 0.10). The relative state R = I + C lay close to zero in every cohort (−0.62 to +0.96) and did not differ between diseases (+0.20 vs +0.24; difference −0.04, −0.82 to 0.74; P = 0.92). Standardised effects on C and I have different denominators and cannot be combined into an effect on R; on the score scale (Fig. 6b), the within-cohort mean differences ΔC and ΔI were of similar magnitude and opposite sign in five of the six TAAD cohorts (ΔR +0.01 to +0.50; GSE294606 −1.00), whereas the ATAA cohorts had small ΔC and ΔR between −0.35 and +0.79.</w:t>
       </w:r>
     </w:p>
     <w:p>
@@ -9425,7 +11685,7 @@
       <w:r>
         <w:drawing>
           <wp:inline xmlns:a="http://schemas.openxmlformats.org/drawingml/2006/main" xmlns:pic="http://schemas.openxmlformats.org/drawingml/2006/picture">
-            <wp:extent cx="5760720" cy="2921821"/>
+            <wp:extent cx="5760720" cy="4220308"/>
             <wp:docPr id="3" name="Picture 3"/>
             <wp:cNvGraphicFramePr>
               <a:graphicFrameLocks noChangeAspect="1"/>
@@ -9446,7 +11706,7 @@
                   <pic:spPr>
                     <a:xfrm>
                       <a:off x="0" y="0"/>
-                      <a:ext cx="5760720" cy="2921821"/>
+                      <a:ext cx="5760720" cy="4220308"/>
                     </a:xfrm>
                     <a:prstGeom prst="rect"/>
                   </pic:spPr>
@@ -9485,7 +11745,7 @@
         <w:rPr>
           <w:sz w:val="20"/>
         </w:rPr>
-        <w:t xml:space="preserve"> Effects on C (x) and I (y) for every dataset: bulk cohorts (circles) with pooled estimates (diamonds), contractile-SMC patient-level effects (stars) and the direct dissection-versus-dilatation contrast (cross); the dashed line I = −C marks an unchanged relative state. </w:t>
+        <w:t xml:space="preserve"> Standardised effects (Hedges' g) on C (x) and I (y) for the bulk cohorts (circles, 95 % CI), the random-effects pooled estimates (diamonds) and the contractile-SMC patient-level effects (stars); because g_C and g_I are scaled by different standard deviations, the effect on R cannot be read from this plane. The GSE318877 dissection-versus-dilatation contrast, whose reference group is dilatation rather than control, is shown in a separate inset; GSE189795 is not shown because no contractile-SMC cluster was recovered. </w:t>
       </w:r>
       <w:r>
         <w:rPr>
@@ -9498,7 +11758,20 @@
         <w:rPr>
           <w:sz w:val="20"/>
         </w:rPr>
-        <w:t xml:space="preserve"> State comparison by programme: pooled effects per disease, whether the diseases differ, and the within-cohort or patient-level evidence; supported and undetermined items are distinguished; no temporal or causal ordering is implied.</w:t>
+        <w:t xml:space="preserve"> Within-dataset mean differences of C and I on the label-free score scale (case minus reference), on which ΔR = ΔC + ΔI and lines of constant ΔR are valid (dashed, ΔR = 0); each point is labelled with its ΔR; values are comparable within but not across datasets, and the GSE318877 point uses dilatation as reference (results/v21_bulk/programme_mean_differences.csv). </w:t>
+      </w:r>
+      <w:r>
+        <w:rPr>
+          <w:b/>
+          <w:sz w:val="20"/>
+        </w:rPr>
+        <w:t>c</w:t>
+      </w:r>
+      <w:r>
+        <w:rPr>
+          <w:sz w:val="20"/>
+        </w:rPr>
+        <w:t xml:space="preserve"> State comparison by programme: pooled effects per disease, whether the diseases differ, the within-cohort or patient-level evidence, and the composition-signature-conditioned status read from the sensitivity results; supported and not-determined items are distinguished, and no temporal or causal ordering is implied.</w:t>
       </w:r>
     </w:p>
     <w:p>
@@ -9553,7 +11826,7 @@
     </w:p>
     <w:p>
       <w:r>
-        <w:t>Conditioning on the three control-cell signature scores (Fig. 2e; Additional file 10) attenuated but retained the TAAD effects on C (standardised coefficient −1.47 to −0.44, −0.75 to −0.13) and I (+1.41 to +1.33, 0.64 to 2.03), and retained glycolysis, oxidative stress, MYC-ribosome, p53 and NF-κB/IL-6 effects. In ATAA the small effect on C was retained (−0.30 to −0.26, −0.50 to −0.03), whereas the injury composite (+0.56 to −0.14), interferon-α (+0.78 to +0.24, −0.10 to 0.58), MHC class II (+0.90 to +0.39) and ECM-collagen (+0.64 to +0.29) effects became uncertain. The ATAA-associated immune and matrix signals at cohort level are therefore not separable from tissue composition with this design, whereas the TAAD-associated contractile loss and metabolic/stress activation are.</w:t>
+        <w:t>Conditioning on the three control-cell signature scores (Fig. 2e; Additional file 10) attenuated but retained the TAAD effects on C (pooled standardised coefficient −1.46 to −0.42, 95 % CI −0.69 to −0.15) and I (+1.38 to +1.19, 0.49 to 1.89), and retained the glycolysis, oxidative-stress, MYC-ribosome, p53 and NF-κB/IL-6 effects. In ATAA the small effect on C was retained (−0.31 to −0.27, −0.49 to −0.05), whereas the injury composite (+0.58 to −0.64), interferon-α (+0.79 to +0.26, −0.36 to 0.89), MHC class II (+0.88 to +0.34) and ECM-collagen (+0.62 to −0.15) effects became uncertain. After conditioning on the three selected cell-signature scores, some TAAD-associated effects therefore remained whereas the ATAA-associated immune and matrix effects did not; because the three scores are expression-based proxies rather than a complete measurement of composition, this is a sensitivity result, not a separation of cell-intrinsic from compositional effects.</w:t>
       </w:r>
     </w:p>
     <w:p>
@@ -9566,7 +11839,7 @@
     </w:p>
     <w:p>
       <w:r>
-        <w:t>In contractile-SMC pseudo-bulk profiles (Fig. 3; Table 2), C was lower in disease than in control in both datasets (GSE155468, ATAA 7 vs 3 patients, g −0.95, 95 % CI −3.93 to −0.16, exact P = 0.167; GSE213740, TAAD 6 vs 3, g −0.98, −4.16 to −0.05, P = 0.167), whereas I showed no clear change (−0.18 and +0.35; intervals including zero). The primary tests of R were not passed (GSE155468, g −0.58, −1.65 to 0.33, exact P = 0.367 over 120 assignments; GSE213740, g −0.35, −1.27 to 1.33, P = 0.786 over 84 assignments); the full-pipeline check with control-referenced standardisation gave P = 0.150 and 0.048. Per-patient scores were widely spread (Fig. 3a–d): the ATAA patient with the lowest R combined a modest contractile decrease with a marked decrease of the injury composite, and the number of contractile SMC per aneurysm patient (50–905) was much smaller than per control (263–2,165), consistent with the dissociation bias noted previously. The exploratory MHC class II score in ATAA SMC was higher than in controls (g +1.27, 0.66 to 3.33; exact P = 0.067; BH = 0.90), and in TAAD SMC the interferon-α score was lower (g −1.00; P = 0.167). Across other cell types (Fig. 3e–g) all intervals were wide; the only exploratory effect with an exact P &lt; 0.05 was a lower injury composite in T cells of TAAD patients (g −1.96, −8.66 to −1.41; P = 0.024). With three controls per dataset, these estimates have limited precision; the data do not show a within-cell difference in the relative state, and they cannot exclude one of moderate size.</w:t>
+        <w:t>In contractile-SMC pseudo-bulk profiles (Fig. 3; Table 2), point estimates of C were lower in disease than in control in both datasets (GSE155468, ATAA 7 vs 3 patients because one aneurysm patient had fewer than 20 contractile SMC, g −0.95, bootstrap 95 % CI −3.93 to −0.16; GSE213740, TAAD 6 vs 3, g −0.98, −4.16 to −0.05), but the exact patient-level tests did not support a difference (P = 0.167 in each dataset, over 120 and 84 assignments), and I showed no clear change (−0.18 and +0.35; intervals including zero). The bootstrap interval and the exact permutation P answer different questions (resampling of fixed patient scores versus the label-permutation null), so an interval excluding zero here is not treated as confirmation. The primary tests of R were not passed (GSE155468, g −0.58, −1.65 to 0.33, exact P = 0.367 over 120 assignments; GSE213740, g −0.35, −1.27 to 1.33, P = 0.786 over 84 assignments); the full-pipeline check with control-referenced standardisation gave P = 0.150 and 0.048, so the TAAD result depends on the scoring convention (label-free versus control-referenced); the control-referenced value is a sensitivity result and does not replace the primary test. Per-patient scores were widely spread (Fig. 3a–d): the ATAA patient with the lowest R combined a modest contractile decrease with a marked decrease of the injury composite, and the number of contractile SMC per aneurysm patient (50–905) was much smaller than per control (263–2,165), consistent with the dissociation bias noted previously. The exploratory MHC class II score in ATAA SMC was higher than in controls (g +1.27, 0.66 to 3.33; exact P = 0.067; BH = 0.90), and in TAAD SMC the interferon-α score was lower (g −1.00; P = 0.167). Across other cell types (Fig. 3e–g) all intervals were wide; the only exploratory effect with an exact P &lt; 0.05 was a lower injury composite in T cells of TAAD patients (g −1.96, −8.66 to −1.41; P = 0.024). With three controls per dataset, these estimates have limited precision; the data neither show a within-cell decrease of C or a difference in the relative state, nor exclude effects of moderate size.</w:t>
       </w:r>
     </w:p>
     <w:p>
@@ -9675,7 +11948,12 @@
         <w:rPr>
           <w:sz w:val="20"/>
         </w:rPr>
-        <w:t xml:space="preserve"> Primary tests and the full-pipeline check.</w:t>
+        <w:t xml:space="preserve"> Primary tests (GSE155468: 7 vs 3 patients, 120 assignments, one aneurysm patient excluded for &lt; 20 contractile SMC; GSE213740: 6 vs 3, 84 assignments) and the full-pipeline check with control-referenced standardisation (sensitivity).</w:t>
+      </w:r>
+    </w:p>
+    <w:p>
+      <w:r>
+        <w:t>Because disease may move cells out of the contractile state, the whole SMC population was scored as a sensitivity analysis (Additional file 4). In GSE155468 the fraction of modulated SMC among captured SMC was higher in aneurysm patients (0.29–0.82 versus 0.13–0.39 in controls; g +2.04, exact P = 0.024, BH = 0.33), and the pooled SMC population accordingly had a lower C (g −1.56, −10.50 to −0.47; P = 0.048) together with a lower I (−1.06; P = 0.11) and R (−1.37; P = 0.073), whereas I was close to zero within both the contractile and the modulated state; the whole-population shift thus reflects state composition rather than an injury-programme increase in cells that left the contractile state, and no scope showed an increase of I or R. In GSE213740 the modulated fraction did not differ (g +0.21; P = 0.76), the whole-SMC results matched the contractile-only picture (C −0.86, P = 0.21; R +0.12, P = 0.79), and modulated SMC showed a non-significant increase of I (g +0.97, 0.42 to 2.14; P = 0.14). None of these exploratory comparisons survived BH adjustment.</w:t>
       </w:r>
     </w:p>
     <w:p>
@@ -9688,7 +11966,108 @@
     </w:p>
     <w:p>
       <w:r>
-        <w:t>[[STAGE_RESULTS]]</w:t>
+        <w:t>GSE222318 comprised 54,173 cells from four acute, three subacute and two chronic dissection patients and five controls. Contractile SMC were sparse in acute samples (27–65 cells per patient, against 85–216 in subacute, 318–581 in chronic and 40–167 in control samples), and one subacute patient had fewer than 20. Acute and subacute samples were intima-media preparations whereas chronic and control samples were whole-wall preparations, so stage is confounded with sampling position and no inferential test was applied (Fig. 4a–d; Table 2). Within contractile SMC, the acute-stage point estimate of C was lower than in controls (g −1.97, 95 % CI −9.70 to −1.14), than in the non-acute stages combined (−1.86, −7.63 to −1.37) and than in subacute samples at the same sampling position (−2.45, 4 vs 2 patients), whereas the injury composite showed no increase in any contrast (acute vs control −0.23, −2.45 to 0.95; acute vs subacute −0.33) and R was correspondingly lower in acute samples (−0.80, −3.54 to 0.34; acute vs subacute −0.97). Among the six injury modules only glycolysis was higher in acute SMC (vs control +1.48, 0.94 to 3.09; vs non-acute +1.04, 0.17 to 2.64), while the hypoxia, oxidative-stress, p53 and NF-κB/IL-6 point estimates were negative. Subacute and chronic SMC did not differ from controls in C, I or R (g −0.27 to +1.09, all intervals including zero). These estimates rest on two to five patients per group and on 27–65 contractile SMC per acute patient, and the acute-versus-control and chronic contrasts also differ in sampling position; they describe a lower contractile score without a higher injury composite in acute-stage contractile SMC and cannot be read as a stage trajectory.</w:t>
+      </w:r>
+    </w:p>
+    <w:p>
+      <w:pPr>
+        <w:jc w:val="center"/>
+      </w:pPr>
+      <w:r>
+        <w:drawing>
+          <wp:inline xmlns:a="http://schemas.openxmlformats.org/drawingml/2006/main" xmlns:pic="http://schemas.openxmlformats.org/drawingml/2006/picture">
+            <wp:extent cx="5760720" cy="3118585"/>
+            <wp:docPr id="5" name="Picture 5"/>
+            <wp:cNvGraphicFramePr>
+              <a:graphicFrameLocks noChangeAspect="1"/>
+            </wp:cNvGraphicFramePr>
+            <a:graphic>
+              <a:graphicData uri="http://schemas.openxmlformats.org/drawingml/2006/picture">
+                <pic:pic>
+                  <pic:nvPicPr>
+                    <pic:cNvPr id="0" name="Fig4_stage.png"/>
+                    <pic:cNvPicPr/>
+                  </pic:nvPicPr>
+                  <pic:blipFill>
+                    <a:blip r:embed="rId13"/>
+                    <a:stretch>
+                      <a:fillRect/>
+                    </a:stretch>
+                  </pic:blipFill>
+                  <pic:spPr>
+                    <a:xfrm>
+                      <a:off x="0" y="0"/>
+                      <a:ext cx="5760720" cy="3118585"/>
+                    </a:xfrm>
+                    <a:prstGeom prst="rect"/>
+                  </pic:spPr>
+                </pic:pic>
+              </a:graphicData>
+            </a:graphic>
+          </wp:inline>
+        </w:drawing>
+      </w:r>
+    </w:p>
+    <w:p>
+      <w:pPr>
+        <w:spacing w:after="280"/>
+      </w:pPr>
+      <w:r>
+        <w:rPr>
+          <w:b/>
+          <w:sz w:val="20"/>
+        </w:rPr>
+        <w:t>Fig. 4 Programme scores across dissection stages (estimation only for GSE222318; primary test for GSE189795).</w:t>
+      </w:r>
+      <w:r>
+        <w:rPr>
+          <w:sz w:val="20"/>
+        </w:rPr>
+        <w:t xml:space="preserve"> </w:t>
+      </w:r>
+      <w:r>
+        <w:rPr>
+          <w:b/>
+          <w:sz w:val="20"/>
+        </w:rPr>
+        <w:t>a–c</w:t>
+      </w:r>
+      <w:r>
+        <w:rPr>
+          <w:sz w:val="20"/>
+        </w:rPr>
+        <w:t xml:space="preserve"> Per-patient C, I and R in contractile SMC of GSE222318 by stage; marker shape, sampling position (intima-media or whole wall), which differs between stages. </w:t>
+      </w:r>
+      <w:r>
+        <w:rPr>
+          <w:b/>
+          <w:sz w:val="20"/>
+        </w:rPr>
+        <w:t>d</w:t>
+      </w:r>
+      <w:r>
+        <w:rPr>
+          <w:sz w:val="20"/>
+        </w:rPr>
+        <w:t xml:space="preserve"> Hedges' g (95 % CI) for stage contrasts, including acute versus non-acute and acute versus subacute at the same sampling position; no inferential test was applied. </w:t>
+      </w:r>
+      <w:r>
+        <w:rPr>
+          <w:b/>
+          <w:sz w:val="20"/>
+        </w:rPr>
+        <w:t>e</w:t>
+      </w:r>
+      <w:r>
+        <w:rPr>
+          <w:sz w:val="20"/>
+        </w:rPr>
+        <w:t xml:space="preserve"> GSE189795 acute TAAD versus control: no contractile-SMC cluster was recovered, so the pre-specified primary test was not estimable; modulated-SMC scores are shown as an exploratory substitute with their exact P values.</w:t>
+      </w:r>
+    </w:p>
+    <w:p>
+      <w:r>
+        <w:t>GSE189795 (five acute TAAD patients, four controls; 33,876 cells after filtering, median 668 detected genes per cell) contained no cluster meeting the contractile-SMC criterion: SMC-like cells were sparse in every sample including the controls (26–371 per patient, 902 in total) and were classified as modulated SMC, while the dataset was dominated by inflammatory myeloid cells, fibroblasts, macrophages and NK cells. The pre-specified primary test of R in contractile SMC was therefore not estimable (Table 2). As an exploratory substitute, scores in modulated-SMC pseudo-bulk profiles (4 vs 4 patients with ≥ 20 cells; 70 assignments) gave a lower C in acute dissection (g −2.47, 95 % CI −6.13 to −1.87; exact P = 0.029, the minimum attainable value, i.e. complete separation of the two groups), no increase of I (+0.44, −0.72 to 2.47; P = 0.46) and a lower R (−0.58, −3.49 to 0.64; P = 0.40); in endothelial cells, fibroblasts, macrophages, inflammatory myeloid cells and NK cells all C, I and R intervals included zero (Fig. 4e). This dataset thus repeats, in a different SMC state and at low per-cell depth, the pattern of a lower contractile score without a higher injury composite in acute dissection, but it does not provide the planned primary test.</w:t>
       </w:r>
     </w:p>
     <w:p>
@@ -9712,7 +12091,7 @@
         <w:drawing>
           <wp:inline xmlns:a="http://schemas.openxmlformats.org/drawingml/2006/main" xmlns:pic="http://schemas.openxmlformats.org/drawingml/2006/picture">
             <wp:extent cx="5760720" cy="4005362"/>
-            <wp:docPr id="5" name="Picture 5"/>
+            <wp:docPr id="6" name="Picture 6"/>
             <wp:cNvGraphicFramePr>
               <a:graphicFrameLocks noChangeAspect="1"/>
             </wp:cNvGraphicFramePr>
@@ -9724,7 +12103,7 @@
                     <pic:cNvPicPr/>
                   </pic:nvPicPr>
                   <pic:blipFill>
-                    <a:blip r:embed="rId13"/>
+                    <a:blip r:embed="rId14"/>
                     <a:stretch>
                       <a:fillRect/>
                     </a:stretch>
@@ -9802,7 +12181,7 @@
     </w:p>
     <w:p>
       <w:r>
-        <w:t>Across ordered dilatation in GSE26155 (No 31, Borderline 6, Yes 22; Fig. 5e; Additional file 11), C decreased (Spearman ρ −0.35; Jonckheere–Terpstra P = 0.006; BH = 0.016; group means +0.17, +0.14, −0.28), as did calcium handling (BH = 0.016), whereas the injury composite showed no trend (ρ +0.03; BH = 0.86) and none of its six modules did (BH ≥ 0.58). R therefore decreased only through C (ρ −0.14; BH = 0.42). In contrast, interferon-α (ρ +0.38; BH = 0.012), IFNG_specific (+0.32; 0.030), MHC class II (+0.49; 0.010), ECM-collagen (+0.32; 0.030), matrix degradation (+0.30; 0.030), cell–matrix adhesion (+0.32; 0.030) and the T-cell, B-cell, NK, macrophage and inflammatory-myeloid signatures (ρ +0.38 to +0.46; BH ≤ 0.015) increased with dilatation. Within a single cohort of intima-media samples, dilatation is thus accompanied by a contractile decrease and by immune and matrix programmes without the injury composite that characterises dissection.</w:t>
+        <w:t>Across ordered dilatation in GSE26155 (No 31, Borderline 6, Yes 22; Fig. 5e; Additional file 11), C decreased (Spearman ρ −0.35; Jonckheere–Terpstra P = 0.006; BH = 0.016; group means +0.17, +0.14, −0.28), as did calcium handling (BH = 0.016), whereas the injury composite showed no trend (ρ +0.03; BH = 0.86) and none of its six modules did (BH ≥ 0.58). R therefore decreased only through C (ρ −0.14; BH = 0.42). In contrast, interferon-α (ρ +0.38; BH = 0.012), IFNG_specific (+0.32; 0.030), MHC class II (+0.49; 0.010), ECM-collagen (+0.32; 0.030), matrix degradation (+0.30; 0.030), cell–matrix adhesion (+0.32; 0.030) and the T-cell, B-cell, NK, macrophage and inflammatory-myeloid signatures (ρ +0.38 to +0.46; BH ≤ 0.015) increased with dilatation. Within this single cohort of intima-media samples, dilatation was thus associated with a contractile decrease and with immune and matrix programmes, whereas no trend of the injury composite was detected; this is an exploratory within-cohort association and does not establish that dilated tissue lacks an injury response.</w:t>
       </w:r>
     </w:p>
     <w:p>
@@ -9815,7 +12194,7 @@
     </w:p>
     <w:p>
       <w:r>
-        <w:t>Fig. 6 summarises the state comparison without temporal or causal ordering. Supported at cohort level are the difference in contractile loss and in the glycolysis, oxidative-stress and MYC-ribosome modules; supported within one cohort are the decrease of C and the increase of interferon, MHC class II, lymphoid and ECM programmes with dilatation. Undetermined are whether the relative state R differs within the same wall cells, [[STAGE_FIG6]] and whether ATAA-associated immune and matrix signals are cell-intrinsic. The tissue states remained distinguishable across cohorts: the nested leave-one-cohort-out classifier, with consensus features recomputed inside each fold, reached a pooled out-of-cohort AUC of 0.90 (accuracy 83.7 %; every TAAD cohort ≥ 71 %; GSE26155 91 %, GSE140947 100 %, GSE235161 68 %, GSE202267 50 %), and the 24 folds holding out one cohort of each disease had a median AUC of 1.00 (interquartile range 0.93–1.00; Additional file 12). Tier 2 signatures rebuilt inside each fold behaved consistently with the Tier 1 results (Additional file 8): TAAD signatures scored in held-out TAAD cohorts with median g 1.7–2.9 (SMC-contraction-related, 2.77, minimum 1.73, six of six folds P &lt; 0.05) and in held-out ATAA cohorts with median g 0.2–0.7; ATAA signatures scored in held-out ATAA cohorts with median g 0.9–1.7 but could be built in only three of four folds for the ECM, antigen-presentation and lymphocyte themes because too few consensus genes remained when GSE26155 was held out, and their effects in TAAD cohorts ranged from −2.1 to +2.8.</w:t>
+        <w:t>Fig. 6 summarises the state comparison without temporal or causal ordering. Supported at cohort level are the difference in contractile loss and in the glycolysis, oxidative-stress and MYC-ribosome modules; supported within one cohort are the decrease of C and the increase of interferon, MHC class II, lymphoid and ECM programmes with dilatation. Not determined are whether the relative organisation of the two programmes differs (R and the patient-level tests are inconclusive), whether the lower C without a higher I in acute-stage contractile SMC of GSE222318 reflects stage or sampling position, and whether the acute-stage pattern holds in a dataset with adequate contractile-SMC recovery (GSE189795 recovered none), and whether ATAA-associated immune and matrix signals are cell-intrinsic. The tissue states remained distinguishable across cohorts: the nested leave-one-cohort-out classifier, with consensus features recomputed inside each fold, reached a pooled out-of-cohort AUC of 0.90 (accuracy 83.7 %; every TAAD cohort ≥ 71 %; GSE26155 91 %, GSE140947 100 %, GSE235161 68 %, GSE202267 50 %), and the 24 folds holding out one cohort of each disease had a median AUC of 1.00 (interquartile range 0.93–1.00; Additional file 12). Tier 2 signatures rebuilt inside each fold behaved consistently with the Tier 1 results (Additional file 8): TAAD signatures scored in held-out TAAD cohorts with median g 1.7–2.9 (SMC-contraction-related, 2.77, minimum 1.73, six of six folds P &lt; 0.05) and in held-out ATAA cohorts with median g 0.2–0.7; ATAA signatures scored in held-out ATAA cohorts with median g 0.9–1.7 but could be built in only three of four folds for the ECM, antigen-presentation and lymphocyte themes because too few consensus genes remained when GSE26155 was held out, and their effects in TAAD cohorts ranged from −2.1 to +2.8.</w:t>
       </w:r>
     </w:p>
     <w:p>
@@ -9828,7 +12207,7 @@
     </w:p>
     <w:p>
       <w:r>
-        <w:t>Two programmes were followed across ten bulk cohorts and six patient-level datasets with the same externally defined scores. At the tissue level, the main difference between ATAA and TAAD lay in the magnitude of contractile loss (Holm P &lt; 0.001) and, less firmly, in the injury composite (Holm P = 0.10), with the glycolysis, oxidative-stress and MYC-ribosome modules carrying most of the latter. The relative state of the two programmes did not differ between the diseases, and all cohorts lay near the line on which R is unchanged. Within contractile SMC the direction of C was the same in both diseases and the relative state showed no clear change; within aneurysm patients the belly did not differ from the neck; within one cohort dilatation was accompanied by contractile decrease and immune and matrix programmes without an injury-composite trend. [[STAGE_DISCUSSION_1]]</w:t>
+        <w:t>Two programmes were followed across ten bulk cohorts and six patient-level datasets with the same externally defined scores. At the tissue level, the main difference between ATAA and TAAD lay in the magnitude of contractile loss (Holm P &lt; 0.001) and, less firmly, in the injury composite (Holm P = 0.10), with the glycolysis, oxidative-stress and MYC-ribosome modules carrying most of the latter. No difference in the relative state of the two programmes was detected between the diseases (Fig. 6). Within contractile SMC the point estimates of C were lower in both diseases but the patient-level tests were inconclusive, and the relative state showed no clear change; within aneurysm patients the belly did not differ from the neck; within one cohort dilatation was associated with contractile decrease and with immune and matrix programmes, and no injury-composite trend was detected. In the stage dataset, acute-stage contractile SMC showed a lower contractile score than control and later-stage SMC without a higher injury composite, but with sampling position confounded with stage and 27–65 cells per acute patient this is an estimate, not a test. The external acute dataset could not provide the planned test because no contractile-SMC cluster was recovered; its exploratory modulated-SMC estimate pointed the same way. Across the single-cell datasets, the injury composite was not raised within contractile SMC of dissection patients, whereas it was raised in bulk dissection tissue; which cells carry the bulk injury-composite signal in dissection tissue, and how much of it reflects composition, is therefore an open question for cell-resolved designs rather than a result of this study.</w:t>
       </w:r>
     </w:p>
     <w:p>
@@ -9841,7 +12220,7 @@
     </w:p>
     <w:p>
       <w:r>
-        <w:t>The hypothesis under test was that the two diseases organise the contractile and injury-response programmes differently, which would have appeared as a difference in R between diseases, between stages, between layers or between regions. With the available data the relation did not differ, so the hypothesis is not supported; it is not refuted, because an unchanged R is compatible with a single intensity axis on which both programmes move together, and because the patient-level tests had minimum attainable P values of 0.017–0.057 and confidence intervals wide enough to contain moderate effects. What the data do show is a difference of intensity: the same combination of contractile loss and injury response is expressed strongly in dissection and weakly in aneurysm at the tissue level, with the metabolic and stress modules providing the clearest separation. This intensity reading is consistent with the glycolytic ENO1/MIF axis described in the recent single-cell atlas [15], whose genes were TAAD-enriched and near-zero in ATAA here across cohorts, and it adds that the axis behaves as part of a broader injury composite rather than as a dissection-specific module.</w:t>
+        <w:t>The hypothesis under test was that the two diseases organise the contractile and injury-response programmes differently, which would have appeared as a difference in R between diseases, between stages, between layers or between regions. With the available data no such difference was detected, so the hypothesis is not supported; it is also not refuted. R is one linear summary of several programme scores whose weights and zero point are set by the scoring rule (C is a mean of member-gene z-scores, I a mean of six re-standardised module scores), not by a biological balance point; its between-disease interval (−0.82 to 0.74) still contains differences of meaningful size, and a large P value is not evidence for the null. Differences in single-module combinations, in patient-level distributions or in the correlation between programmes would not necessarily appear in R. The patient-level tests had minimum attainable P values of 0.017–0.057 and wide intervals. What the data do show is that the pre-specified contractile programme and some metabolic and stress modules differ in effect size between the diseases at the tissue level; whether the two programmes are organised in the same way, along a single intensity axis, or differently cannot be determined from these data. The glycolytic ENO1/MIF axis described in the recent single-cell atlas [15] behaved consistently with this: its genes were TAAD-enriched and near-zero in ATAA across cohorts, as part of a broader set of metabolic and stress modules rather than as an isolated dissection-specific module.</w:t>
       </w:r>
     </w:p>
     <w:p>
@@ -9854,7 +12233,7 @@
     </w:p>
     <w:p>
       <w:r>
-        <w:t>The ATAA cohorts differed from controls by interferon, MHC class II, lymphoid and ECM programmes, and within one cohort these programmes increased with the degree of dilatation while the contractile score decreased. Two cautions apply. First, at cohort level these effects became uncertain after conditioning on control-cell signature scores, so they cannot be separated from tissue composition with bulk data; the higher MHC class II score in aneurysm SMC pseudo-bulk (exact P = 0.067 with seven patients) is suggestive but underpowered. Second, the ordered-dilatation cohort consists of intima-media samples from tricuspid-valve patients and compares degrees of dilatation rather than disease and control tissue; its results are exploratory. With these limits, the aneurysm state is characterised as a contractile decrease combined with immune and matrix programmes, without the hypoxia, glycolysis, oxidative-stress, MYC and p53 modules that accompany dissection. This is a different composition of programmes at the tissue level, not evidence that the same wall cells organise the programmes differently.</w:t>
+        <w:t>The ATAA cohorts differed from controls by interferon, MHC class II, lymphoid and ECM programmes, and within one cohort these programmes increased with the degree of dilatation while the contractile score decreased. Two cautions apply. First, at cohort level these effects became uncertain after conditioning on three control-cell signature scores, so with bulk data they could not be distinguished from tissue composition; the higher MHC class II score in aneurysm SMC pseudo-bulk (exact P = 0.067 with seven patients) is suggestive but underpowered. Second, the ordered-dilatation cohort consists of intima-media samples from tricuspid-valve patients and compares degrees of dilatation rather than disease and control tissue; its results are exploratory. With these limits, the aneurysm cohorts and the ordered-dilatation cohort show a contractile decrease together with immune and matrix programmes, while trends of the hypoxia, glycolysis, oxidative-stress, MYC and p53 modules with dilatation were not detected; whether these modules are absent or present at a level the data cannot resolve is not determined. This describes a different set of tissue-level associations, not evidence that the same wall cells organise the programmes differently.</w:t>
       </w:r>
     </w:p>
     <w:p>
@@ -9880,7 +12259,7 @@
     </w:p>
     <w:p>
       <w:r>
-        <w:t>The cellular-heterogeneity comparison summarised as "erosion or explosion" [16] and the 80-aorta atlas [15] both report that aneurysm and dissection differ. The present study does not repeat the "different diseases" contrast; it tests how the differences are organised and finds that the available patient-level structure does not show a different organisation of the two programmes, only a different intensity and a different accompanying composition. The direct dissection-versus-dilatation cohort [19] gave directionally consistent patient-level estimates (lower C, lower I and lower R in dissection media) that could not be tested with three versus four patients.</w:t>
+        <w:t>The cellular-heterogeneity comparison summarised as "erosion or explosion" [16] and the 80-aorta atlas [15] both report that aneurysm and dissection differ. The present study does not repeat the "different diseases" contrast; it asks how the differences are organised and finds that the available patient-level structure neither shows nor excludes a different organisation of the two programmes; what is supported is a difference in the effect sizes of specific programmes and a different set of accompanying tissue-level associations. The direct dissection-versus-dilatation cohort [19] gave directionally consistent patient-level estimates (lower C, lower I and lower R in dissection media) that could not be tested with three versus four patients.</w:t>
       </w:r>
     </w:p>
     <w:p>
@@ -9893,7 +12272,7 @@
     </w:p>
     <w:p>
       <w:r>
-        <w:t>Control tissues differ between cohorts (organ donors, transplant donors, non-dilated surgical aorta), and disease is confounded with cohort, so cohort-level differences were tested at the cohort level and not by mixing samples. Label-free standardisation makes scores comparable within a dataset but not across datasets, and effect sizes rather than scores were compared. The single-cell datasets had three controls each, and the primary tests were exact but with small numbers of assignments. [[STAGE_LIMITATION]] Tier 1 modules are external definitions and do not capture every relevant programme; the injury composite weights six modules equally by declaration. The GSE235161 subgroup codes could not be mapped to the published groups, and GSE190635 could not be re-processed. Sex, age, valve morphology and medication were not uniformly available and were not modelled. No temporal or causal ordering can be inferred from surgical tissue.</w:t>
+        <w:t>Control tissues differ between cohorts (organ donors, transplant donors, non-dilated surgical aorta), and disease is confounded with cohort, so cohort-level differences were tested at the cohort level and not by mixing samples. Label-free standardisation makes scores comparable within a dataset but not across datasets, and effect sizes rather than scores were compared; standardised effects on C and I have different denominators, so R iso-lines are meaningful only on the score scale within a dataset (Fig. 6b). R is one pre-specified linear summary and does not test all ways in which two programmes could be organised. The single-cell datasets had three controls each, and the primary tests were exact but with small numbers of assignments; the contractile-SMC analysis of GSE155468 used 7 of 8 aneurysm patients. In GSE222318, sampling position was confounded with stage and acute samples contained few contractile SMC, so stage contrasts are estimates only. GSE189795 recovered few SMC in all samples and no contractile-SMC cluster, so its pre-specified test was not estimable and only an exploratory modulated-SMC estimate is reported; the F2 family therefore rests on two datasets. Tier 1 modules are external definitions and do not capture every relevant programme; the injury composite weights six modules equally by declaration. The GSE235161 subgroup codes could not be mapped to the published groups, and GSE190635 could not be re-processed. Sex, age, valve morphology and medication were not uniformly available and were not modelled. No temporal or causal ordering can be inferred from surgical tissue.</w:t>
       </w:r>
     </w:p>
     <w:p>
@@ -9906,7 +12285,7 @@
     </w:p>
     <w:p>
       <w:r>
-        <w:t>At the tissue level, ascending aortic aneurysm and type A dissection differ mainly in the magnitude of contractile loss and metabolic/stress activation, not in the relative state of the contractile and injury-response programmes. The hypothesis that the two diseases organise these programmes differently was not supported by the available patient-level data, which were underpowered for that question. Aneurysmal dilatation is accompanied by contractile decrease and by interferon, antigen-presentation, lymphoid and matrix programmes without the injury composite of dissection. Programme-level scores with externally defined modules provide a reproducible unit for comparing aortic tissue states across cohorts and are proposed as the basis for prospective, stage-annotated and layer-resolved sampling designs.</w:t>
+        <w:t>In the included public tissue transcriptome cohorts, type A dissection showed a larger decrease of contractile-related expression and stronger increases of some metabolic and stress modules than ascending aortic aneurysm. The pre-specified relative-state measure R showed no detectable difference between the diseases, and the patient-level analyses within cell types and within patients gave no consistent support, so whether these tissue-level differences correspond to a different organisation of the two programmes cannot be determined from the available data. In one ordered-dilatation cohort, contractile, immune and matrix programmes showed different associations with dilatation; their generality across cohorts and their cellular source remain to be tested. Programme-level scores with externally defined modules provide a reproducible unit for such comparisons and can be applied to stage-annotated, layer-resolved and histologically phenotyped sampling designs.</w:t>
       </w:r>
     </w:p>
     <w:p>
@@ -10357,63 +12736,6 @@
           <w:i/>
         </w:rPr>
         <w:t>Datasets without a linked primary publication at the time of analysis (GSE235161, GSE202267, GSE294606, GSE267434, GSE147026, GSE190635, GSE213740, GSE189795, GSE222318) are cited by GEO accession [42]. Reference details for [15], [16] and [19] are to be completed from the final published versions.</w:t>
-      </w:r>
-    </w:p>
-    <w:p>
-      <w:pPr>
-        <w:spacing w:after="280"/>
-      </w:pPr>
-      <w:r>
-        <w:rPr>
-          <w:b/>
-          <w:sz w:val="20"/>
-        </w:rPr>
-        <w:t>Fig. 4 Programme scores across dissection stages (estimation only for GSE222318; primary test for GSE189795).</w:t>
-      </w:r>
-      <w:r>
-        <w:rPr>
-          <w:sz w:val="20"/>
-        </w:rPr>
-        <w:t xml:space="preserve"> </w:t>
-      </w:r>
-      <w:r>
-        <w:rPr>
-          <w:b/>
-          <w:sz w:val="20"/>
-        </w:rPr>
-        <w:t>a–c</w:t>
-      </w:r>
-      <w:r>
-        <w:rPr>
-          <w:sz w:val="20"/>
-        </w:rPr>
-        <w:t xml:space="preserve"> Per-patient C, I and R in contractile SMC of GSE222318 by stage; marker shape, sampling position (intima-media or whole wall), which differs between stages. </w:t>
-      </w:r>
-      <w:r>
-        <w:rPr>
-          <w:b/>
-          <w:sz w:val="20"/>
-        </w:rPr>
-        <w:t>d</w:t>
-      </w:r>
-      <w:r>
-        <w:rPr>
-          <w:sz w:val="20"/>
-        </w:rPr>
-        <w:t xml:space="preserve"> Hedges' g (95 % CI) for stage contrasts, including acute versus non-acute and acute versus subacute at the same sampling position; no inferential test was applied. </w:t>
-      </w:r>
-      <w:r>
-        <w:rPr>
-          <w:b/>
-          <w:sz w:val="20"/>
-        </w:rPr>
-        <w:t>e</w:t>
-      </w:r>
-      <w:r>
-        <w:rPr>
-          <w:sz w:val="20"/>
-        </w:rPr>
-        <w:t xml:space="preserve"> GSE189795 acute TAAD versus control in contractile SMC with the exact primary test of R.</w:t>
       </w:r>
     </w:p>
     <w:p>

</xml_diff>